<commit_message>
docs: changes in docs
</commit_message>
<xml_diff>
--- a/doc/pacierz_brzoza_dokumentacja.docx
+++ b/doc/pacierz_brzoza_dokumentacja.docx
@@ -680,6 +680,50 @@
     </w:p>
     <w:p>
       <w:pPr>
+        <w:pStyle w:val="Normal"/>
+        <w:rPr/>
+      </w:pPr>
+      <w:r>
+        <w:rPr>
+          <w:rStyle w:val="Nagwek1Znak"/>
+          <w:rFonts w:ascii="Times New Roman" w:hAnsi="Times New Roman"/>
+          <w:b w:val="false"/>
+          <w:bCs w:val="false"/>
+          <w:sz w:val="24"/>
+          <w:szCs w:val="24"/>
+        </w:rPr>
+        <w:t>Cz</w:t>
+      </w:r>
+      <w:r>
+        <w:rPr>
+          <w:rStyle w:val="Nagwek1Znak"/>
+          <w:rFonts w:ascii="Times New Roman" w:hAnsi="Times New Roman"/>
+          <w:b w:val="false"/>
+          <w:bCs w:val="false"/>
+          <w:sz w:val="24"/>
+          <w:szCs w:val="24"/>
+        </w:rPr>
+        <w:t>ęść teoretyczna skupia się na definicjach JSON oraz JSON Schema.</w:t>
+      </w:r>
+    </w:p>
+    <w:p>
+      <w:pPr>
+        <w:pStyle w:val="Normal"/>
+        <w:rPr>
+          <w:rStyle w:val="Nagwek1Znak"/>
+          <w:rFonts w:ascii="Times New Roman" w:hAnsi="Times New Roman"/>
+          <w:b w:val="false"/>
+          <w:bCs w:val="false"/>
+          <w:sz w:val="24"/>
+          <w:szCs w:val="24"/>
+        </w:rPr>
+      </w:pPr>
+      <w:r>
+        <w:rPr/>
+      </w:r>
+    </w:p>
+    <w:p>
+      <w:pPr>
         <w:pStyle w:val="Heading2"/>
         <w:rPr/>
       </w:pPr>
@@ -791,7 +835,7 @@
         <w:tblStyle w:val="Tabela-Siatka"/>
         <w:tblW w:w="9590" w:type="dxa"/>
         <w:jc w:val="start"/>
-        <w:tblInd w:w="38" w:type="dxa"/>
+        <w:tblInd w:w="151" w:type="dxa"/>
         <w:tblLayout w:type="fixed"/>
         <w:tblCellMar>
           <w:top w:w="0" w:type="dxa"/>
@@ -814,291 +858,374 @@
           <w:p>
             <w:pPr>
               <w:pStyle w:val="Normal"/>
-              <w:widowControl/>
-              <w:spacing w:before="0" w:after="0"/>
-              <w:rPr>
-                <w:szCs w:val="22"/>
+              <w:pBdr/>
+              <w:shd w:fill="FFFFFF" w:val="clear"/>
+              <w:jc w:val="start"/>
+              <w:rPr>
+                <w:rFonts w:ascii="Consolas" w:hAnsi="Consolas"/>
+                <w:sz w:val="20"/>
+                <w:szCs w:val="20"/>
               </w:rPr>
             </w:pPr>
             <w:r>
               <w:rPr>
-                <w:rFonts w:cs="Times New Roman"/>
-                <w:kern w:val="0"/>
-                <w:szCs w:val="22"/>
-                <w:lang w:val="pl-PL" w:bidi="ar-SA"/>
+                <w:rFonts w:ascii="Consolas" w:hAnsi="Consolas"/>
+                <w:b w:val="false"/>
+                <w:i w:val="false"/>
+                <w:color w:val="080808"/>
+                <w:sz w:val="20"/>
+                <w:szCs w:val="20"/>
               </w:rPr>
               <w:t>{</w:t>
-            </w:r>
-          </w:p>
-          <w:p>
-            <w:pPr>
-              <w:pStyle w:val="Normal"/>
-              <w:widowControl/>
-              <w:spacing w:before="0" w:after="0"/>
-              <w:rPr>
-                <w:szCs w:val="22"/>
-              </w:rPr>
-            </w:pPr>
-            <w:r>
-              <w:rPr>
-                <w:rFonts w:cs="Times New Roman"/>
-                <w:kern w:val="0"/>
-                <w:szCs w:val="22"/>
-                <w:lang w:val="pl-PL" w:bidi="ar-SA"/>
-              </w:rPr>
+              <w:br/>
               <w:t xml:space="preserve">  </w:t>
             </w:r>
             <w:r>
               <w:rPr>
-                <w:rFonts w:cs="Times New Roman"/>
-                <w:kern w:val="0"/>
-                <w:szCs w:val="22"/>
-                <w:lang w:val="pl-PL" w:bidi="ar-SA"/>
-              </w:rPr>
-              <w:t>"first_name": "George",</w:t>
-            </w:r>
-          </w:p>
-          <w:p>
-            <w:pPr>
-              <w:pStyle w:val="Normal"/>
-              <w:widowControl/>
-              <w:spacing w:before="0" w:after="0"/>
-              <w:rPr>
-                <w:szCs w:val="22"/>
-              </w:rPr>
-            </w:pPr>
-            <w:r>
-              <w:rPr>
-                <w:rFonts w:cs="Times New Roman"/>
-                <w:kern w:val="0"/>
-                <w:szCs w:val="22"/>
-                <w:lang w:val="pl-PL" w:bidi="ar-SA"/>
-              </w:rPr>
+                <w:rFonts w:ascii="Consolas" w:hAnsi="Consolas"/>
+                <w:b w:val="false"/>
+                <w:i w:val="false"/>
+                <w:color w:val="871094"/>
+                <w:sz w:val="20"/>
+                <w:szCs w:val="20"/>
+              </w:rPr>
+              <w:t>"first_name"</w:t>
+            </w:r>
+            <w:r>
+              <w:rPr>
+                <w:rFonts w:ascii="Consolas" w:hAnsi="Consolas"/>
+                <w:b w:val="false"/>
+                <w:i w:val="false"/>
+                <w:color w:val="080808"/>
+                <w:sz w:val="20"/>
+                <w:szCs w:val="20"/>
+              </w:rPr>
+              <w:t xml:space="preserve">: </w:t>
+            </w:r>
+            <w:r>
+              <w:rPr>
+                <w:rFonts w:ascii="Consolas" w:hAnsi="Consolas"/>
+                <w:b w:val="false"/>
+                <w:i w:val="false"/>
+                <w:color w:val="067D17"/>
+                <w:sz w:val="20"/>
+                <w:szCs w:val="20"/>
+              </w:rPr>
+              <w:t>"George"</w:t>
+            </w:r>
+            <w:r>
+              <w:rPr>
+                <w:rFonts w:ascii="Consolas" w:hAnsi="Consolas"/>
+                <w:b w:val="false"/>
+                <w:i w:val="false"/>
+                <w:color w:val="080808"/>
+                <w:sz w:val="20"/>
+                <w:szCs w:val="20"/>
+              </w:rPr>
+              <w:t>,</w:t>
+              <w:br/>
               <w:t xml:space="preserve">  </w:t>
             </w:r>
             <w:r>
               <w:rPr>
-                <w:rFonts w:cs="Times New Roman"/>
-                <w:kern w:val="0"/>
-                <w:szCs w:val="22"/>
-                <w:lang w:val="pl-PL" w:bidi="ar-SA"/>
-              </w:rPr>
-              <w:t>"last_name": "Washington",</w:t>
-            </w:r>
-          </w:p>
-          <w:p>
-            <w:pPr>
-              <w:pStyle w:val="Normal"/>
-              <w:widowControl/>
-              <w:spacing w:before="0" w:after="0"/>
-              <w:rPr>
-                <w:szCs w:val="22"/>
-              </w:rPr>
-            </w:pPr>
-            <w:r>
-              <w:rPr>
-                <w:rFonts w:cs="Times New Roman"/>
-                <w:kern w:val="0"/>
-                <w:szCs w:val="22"/>
-                <w:lang w:val="pl-PL" w:bidi="ar-SA"/>
-              </w:rPr>
+                <w:rFonts w:ascii="Consolas" w:hAnsi="Consolas"/>
+                <w:b w:val="false"/>
+                <w:i w:val="false"/>
+                <w:color w:val="871094"/>
+                <w:sz w:val="20"/>
+                <w:szCs w:val="20"/>
+              </w:rPr>
+              <w:t>"last_name"</w:t>
+            </w:r>
+            <w:r>
+              <w:rPr>
+                <w:rFonts w:ascii="Consolas" w:hAnsi="Consolas"/>
+                <w:b w:val="false"/>
+                <w:i w:val="false"/>
+                <w:color w:val="080808"/>
+                <w:sz w:val="20"/>
+                <w:szCs w:val="20"/>
+              </w:rPr>
+              <w:t xml:space="preserve">: </w:t>
+            </w:r>
+            <w:r>
+              <w:rPr>
+                <w:rFonts w:ascii="Consolas" w:hAnsi="Consolas"/>
+                <w:b w:val="false"/>
+                <w:i w:val="false"/>
+                <w:color w:val="067D17"/>
+                <w:sz w:val="20"/>
+                <w:szCs w:val="20"/>
+              </w:rPr>
+              <w:t>"Washington"</w:t>
+            </w:r>
+            <w:r>
+              <w:rPr>
+                <w:rFonts w:ascii="Consolas" w:hAnsi="Consolas"/>
+                <w:b w:val="false"/>
+                <w:i w:val="false"/>
+                <w:color w:val="080808"/>
+                <w:sz w:val="20"/>
+                <w:szCs w:val="20"/>
+              </w:rPr>
+              <w:t>,</w:t>
+              <w:br/>
               <w:t xml:space="preserve">  </w:t>
             </w:r>
             <w:r>
               <w:rPr>
-                <w:rFonts w:cs="Times New Roman"/>
-                <w:kern w:val="0"/>
-                <w:szCs w:val="22"/>
-                <w:lang w:val="pl-PL" w:bidi="ar-SA"/>
-              </w:rPr>
-              <w:t>"birthday": "1732-02-22",</w:t>
-            </w:r>
-          </w:p>
-          <w:p>
-            <w:pPr>
-              <w:pStyle w:val="Normal"/>
-              <w:widowControl/>
-              <w:spacing w:before="0" w:after="0"/>
-              <w:rPr>
-                <w:szCs w:val="22"/>
-              </w:rPr>
-            </w:pPr>
-            <w:r>
-              <w:rPr>
-                <w:rFonts w:cs="Times New Roman"/>
-                <w:kern w:val="0"/>
-                <w:szCs w:val="22"/>
-                <w:lang w:val="pl-PL" w:bidi="ar-SA"/>
-              </w:rPr>
+                <w:rFonts w:ascii="Consolas" w:hAnsi="Consolas"/>
+                <w:b w:val="false"/>
+                <w:i w:val="false"/>
+                <w:color w:val="871094"/>
+                <w:sz w:val="20"/>
+                <w:szCs w:val="20"/>
+              </w:rPr>
+              <w:t>"birthday"</w:t>
+            </w:r>
+            <w:r>
+              <w:rPr>
+                <w:rFonts w:ascii="Consolas" w:hAnsi="Consolas"/>
+                <w:b w:val="false"/>
+                <w:i w:val="false"/>
+                <w:color w:val="080808"/>
+                <w:sz w:val="20"/>
+                <w:szCs w:val="20"/>
+              </w:rPr>
+              <w:t xml:space="preserve">: </w:t>
+            </w:r>
+            <w:r>
+              <w:rPr>
+                <w:rFonts w:ascii="Consolas" w:hAnsi="Consolas"/>
+                <w:b w:val="false"/>
+                <w:i w:val="false"/>
+                <w:color w:val="067D17"/>
+                <w:sz w:val="20"/>
+                <w:szCs w:val="20"/>
+              </w:rPr>
+              <w:t>"1732-02-22"</w:t>
+            </w:r>
+            <w:r>
+              <w:rPr>
+                <w:rFonts w:ascii="Consolas" w:hAnsi="Consolas"/>
+                <w:b w:val="false"/>
+                <w:i w:val="false"/>
+                <w:color w:val="080808"/>
+                <w:sz w:val="20"/>
+                <w:szCs w:val="20"/>
+              </w:rPr>
+              <w:t>,</w:t>
+              <w:br/>
               <w:t xml:space="preserve">  </w:t>
             </w:r>
             <w:r>
               <w:rPr>
-                <w:rFonts w:cs="Times New Roman"/>
-                <w:kern w:val="0"/>
-                <w:szCs w:val="22"/>
-                <w:lang w:val="pl-PL" w:bidi="ar-SA"/>
-              </w:rPr>
-              <w:t>"address": {</w:t>
-            </w:r>
-          </w:p>
-          <w:p>
-            <w:pPr>
-              <w:pStyle w:val="Normal"/>
-              <w:widowControl/>
-              <w:spacing w:before="0" w:after="0"/>
-              <w:rPr>
-                <w:szCs w:val="22"/>
-              </w:rPr>
-            </w:pPr>
-            <w:r>
-              <w:rPr>
-                <w:rFonts w:cs="Times New Roman"/>
-                <w:kern w:val="0"/>
-                <w:szCs w:val="22"/>
-                <w:lang w:val="pl-PL" w:bidi="ar-SA"/>
-              </w:rPr>
+                <w:rFonts w:ascii="Consolas" w:hAnsi="Consolas"/>
+                <w:b w:val="false"/>
+                <w:i w:val="false"/>
+                <w:color w:val="871094"/>
+                <w:sz w:val="20"/>
+                <w:szCs w:val="20"/>
+              </w:rPr>
+              <w:t>"address"</w:t>
+            </w:r>
+            <w:r>
+              <w:rPr>
+                <w:rFonts w:ascii="Consolas" w:hAnsi="Consolas"/>
+                <w:b w:val="false"/>
+                <w:i w:val="false"/>
+                <w:color w:val="080808"/>
+                <w:sz w:val="20"/>
+                <w:szCs w:val="20"/>
+              </w:rPr>
+              <w:t>: {</w:t>
+              <w:br/>
               <w:t xml:space="preserve">    </w:t>
             </w:r>
             <w:r>
               <w:rPr>
-                <w:rFonts w:cs="Times New Roman"/>
-                <w:kern w:val="0"/>
-                <w:szCs w:val="22"/>
-                <w:lang w:val="pl-PL" w:bidi="ar-SA"/>
-              </w:rPr>
-              <w:t>"street_address": "3200 Mount Vernon Memorial Highway",</w:t>
-            </w:r>
-          </w:p>
-          <w:p>
-            <w:pPr>
-              <w:pStyle w:val="Normal"/>
-              <w:widowControl/>
-              <w:spacing w:before="0" w:after="0"/>
-              <w:rPr>
-                <w:szCs w:val="22"/>
-              </w:rPr>
-            </w:pPr>
-            <w:r>
-              <w:rPr>
-                <w:rFonts w:cs="Times New Roman"/>
-                <w:kern w:val="0"/>
-                <w:szCs w:val="22"/>
-                <w:lang w:val="pl-PL" w:bidi="ar-SA"/>
-              </w:rPr>
+                <w:rFonts w:ascii="Consolas" w:hAnsi="Consolas"/>
+                <w:b w:val="false"/>
+                <w:i w:val="false"/>
+                <w:color w:val="871094"/>
+                <w:sz w:val="20"/>
+                <w:szCs w:val="20"/>
+              </w:rPr>
+              <w:t>"street_address"</w:t>
+            </w:r>
+            <w:r>
+              <w:rPr>
+                <w:rFonts w:ascii="Consolas" w:hAnsi="Consolas"/>
+                <w:b w:val="false"/>
+                <w:i w:val="false"/>
+                <w:color w:val="080808"/>
+                <w:sz w:val="20"/>
+                <w:szCs w:val="20"/>
+              </w:rPr>
+              <w:t xml:space="preserve">: </w:t>
+            </w:r>
+            <w:r>
+              <w:rPr>
+                <w:rFonts w:ascii="Consolas" w:hAnsi="Consolas"/>
+                <w:b w:val="false"/>
+                <w:i w:val="false"/>
+                <w:color w:val="067D17"/>
+                <w:sz w:val="20"/>
+                <w:szCs w:val="20"/>
+              </w:rPr>
+              <w:t>"3200 Mount Vernon Memorial Highway"</w:t>
+            </w:r>
+            <w:r>
+              <w:rPr>
+                <w:rFonts w:ascii="Consolas" w:hAnsi="Consolas"/>
+                <w:b w:val="false"/>
+                <w:i w:val="false"/>
+                <w:color w:val="080808"/>
+                <w:sz w:val="20"/>
+                <w:szCs w:val="20"/>
+              </w:rPr>
+              <w:t>,</w:t>
+              <w:br/>
               <w:t xml:space="preserve">    </w:t>
             </w:r>
             <w:r>
               <w:rPr>
-                <w:rFonts w:cs="Times New Roman"/>
-                <w:kern w:val="0"/>
-                <w:szCs w:val="22"/>
-                <w:lang w:val="pl-PL" w:bidi="ar-SA"/>
-              </w:rPr>
-              <w:t>"city": "Mount Vernon",</w:t>
-            </w:r>
-          </w:p>
-          <w:p>
-            <w:pPr>
-              <w:pStyle w:val="Normal"/>
-              <w:widowControl/>
-              <w:spacing w:before="0" w:after="0"/>
-              <w:rPr>
-                <w:szCs w:val="22"/>
-              </w:rPr>
-            </w:pPr>
-            <w:r>
-              <w:rPr>
-                <w:rFonts w:cs="Times New Roman"/>
-                <w:kern w:val="0"/>
-                <w:szCs w:val="22"/>
-                <w:lang w:val="pl-PL" w:bidi="ar-SA"/>
-              </w:rPr>
+                <w:rFonts w:ascii="Consolas" w:hAnsi="Consolas"/>
+                <w:b w:val="false"/>
+                <w:i w:val="false"/>
+                <w:color w:val="871094"/>
+                <w:sz w:val="20"/>
+                <w:szCs w:val="20"/>
+              </w:rPr>
+              <w:t>"city"</w:t>
+            </w:r>
+            <w:r>
+              <w:rPr>
+                <w:rFonts w:ascii="Consolas" w:hAnsi="Consolas"/>
+                <w:b w:val="false"/>
+                <w:i w:val="false"/>
+                <w:color w:val="080808"/>
+                <w:sz w:val="20"/>
+                <w:szCs w:val="20"/>
+              </w:rPr>
+              <w:t xml:space="preserve">: </w:t>
+            </w:r>
+            <w:r>
+              <w:rPr>
+                <w:rFonts w:ascii="Consolas" w:hAnsi="Consolas"/>
+                <w:b w:val="false"/>
+                <w:i w:val="false"/>
+                <w:color w:val="067D17"/>
+                <w:sz w:val="20"/>
+                <w:szCs w:val="20"/>
+              </w:rPr>
+              <w:t>"Mount Vernon"</w:t>
+            </w:r>
+            <w:r>
+              <w:rPr>
+                <w:rFonts w:ascii="Consolas" w:hAnsi="Consolas"/>
+                <w:b w:val="false"/>
+                <w:i w:val="false"/>
+                <w:color w:val="080808"/>
+                <w:sz w:val="20"/>
+                <w:szCs w:val="20"/>
+              </w:rPr>
+              <w:t>,</w:t>
+              <w:br/>
               <w:t xml:space="preserve">    </w:t>
             </w:r>
             <w:r>
               <w:rPr>
-                <w:rFonts w:cs="Times New Roman"/>
-                <w:kern w:val="0"/>
-                <w:szCs w:val="22"/>
-                <w:lang w:val="pl-PL" w:bidi="ar-SA"/>
-              </w:rPr>
-              <w:t>"state": "Virginia",</w:t>
-            </w:r>
-          </w:p>
-          <w:p>
-            <w:pPr>
-              <w:pStyle w:val="Normal"/>
-              <w:widowControl/>
-              <w:spacing w:before="0" w:after="0"/>
-              <w:rPr>
-                <w:szCs w:val="22"/>
-              </w:rPr>
-            </w:pPr>
-            <w:r>
-              <w:rPr>
-                <w:rFonts w:cs="Times New Roman"/>
-                <w:kern w:val="0"/>
-                <w:szCs w:val="22"/>
-                <w:lang w:val="pl-PL" w:bidi="ar-SA"/>
-              </w:rPr>
+                <w:rFonts w:ascii="Consolas" w:hAnsi="Consolas"/>
+                <w:b w:val="false"/>
+                <w:i w:val="false"/>
+                <w:color w:val="871094"/>
+                <w:sz w:val="20"/>
+                <w:szCs w:val="20"/>
+              </w:rPr>
+              <w:t>"state"</w:t>
+            </w:r>
+            <w:r>
+              <w:rPr>
+                <w:rFonts w:ascii="Consolas" w:hAnsi="Consolas"/>
+                <w:b w:val="false"/>
+                <w:i w:val="false"/>
+                <w:color w:val="080808"/>
+                <w:sz w:val="20"/>
+                <w:szCs w:val="20"/>
+              </w:rPr>
+              <w:t xml:space="preserve">: </w:t>
+            </w:r>
+            <w:r>
+              <w:rPr>
+                <w:rFonts w:ascii="Consolas" w:hAnsi="Consolas"/>
+                <w:b w:val="false"/>
+                <w:i w:val="false"/>
+                <w:color w:val="067D17"/>
+                <w:sz w:val="20"/>
+                <w:szCs w:val="20"/>
+              </w:rPr>
+              <w:t>"Virginia"</w:t>
+            </w:r>
+            <w:r>
+              <w:rPr>
+                <w:rFonts w:ascii="Consolas" w:hAnsi="Consolas"/>
+                <w:b w:val="false"/>
+                <w:i w:val="false"/>
+                <w:color w:val="080808"/>
+                <w:sz w:val="20"/>
+                <w:szCs w:val="20"/>
+              </w:rPr>
+              <w:t>,</w:t>
+              <w:br/>
               <w:t xml:space="preserve">    </w:t>
             </w:r>
             <w:r>
               <w:rPr>
-                <w:rFonts w:cs="Times New Roman"/>
-                <w:kern w:val="0"/>
-                <w:szCs w:val="22"/>
-                <w:lang w:val="pl-PL" w:bidi="ar-SA"/>
-              </w:rPr>
-              <w:t>"country": "United States"</w:t>
-            </w:r>
-          </w:p>
-          <w:p>
-            <w:pPr>
-              <w:pStyle w:val="Normal"/>
-              <w:widowControl/>
-              <w:spacing w:before="0" w:after="0"/>
-              <w:rPr>
-                <w:szCs w:val="22"/>
-              </w:rPr>
-            </w:pPr>
-            <w:r>
-              <w:rPr>
-                <w:rFonts w:cs="Times New Roman"/>
-                <w:kern w:val="0"/>
-                <w:szCs w:val="22"/>
-                <w:lang w:val="pl-PL" w:bidi="ar-SA"/>
-              </w:rPr>
+                <w:rFonts w:ascii="Consolas" w:hAnsi="Consolas"/>
+                <w:b w:val="false"/>
+                <w:i w:val="false"/>
+                <w:color w:val="871094"/>
+                <w:sz w:val="20"/>
+                <w:szCs w:val="20"/>
+              </w:rPr>
+              <w:t>"country"</w:t>
+            </w:r>
+            <w:r>
+              <w:rPr>
+                <w:rFonts w:ascii="Consolas" w:hAnsi="Consolas"/>
+                <w:b w:val="false"/>
+                <w:i w:val="false"/>
+                <w:color w:val="080808"/>
+                <w:sz w:val="20"/>
+                <w:szCs w:val="20"/>
+              </w:rPr>
+              <w:t xml:space="preserve">: </w:t>
+            </w:r>
+            <w:r>
+              <w:rPr>
+                <w:rFonts w:ascii="Consolas" w:hAnsi="Consolas"/>
+                <w:b w:val="false"/>
+                <w:i w:val="false"/>
+                <w:color w:val="067D17"/>
+                <w:sz w:val="20"/>
+                <w:szCs w:val="20"/>
+              </w:rPr>
+              <w:t>"United States"</w:t>
+              <w:br/>
               <w:t xml:space="preserve">  </w:t>
             </w:r>
             <w:r>
               <w:rPr>
-                <w:rFonts w:cs="Times New Roman"/>
-                <w:kern w:val="0"/>
-                <w:szCs w:val="22"/>
-                <w:lang w:val="pl-PL" w:bidi="ar-SA"/>
+                <w:rFonts w:ascii="Consolas" w:hAnsi="Consolas"/>
+                <w:b w:val="false"/>
+                <w:i w:val="false"/>
+                <w:color w:val="080808"/>
+                <w:sz w:val="20"/>
+                <w:szCs w:val="20"/>
               </w:rPr>
               <w:t>}</w:t>
-            </w:r>
-          </w:p>
-          <w:p>
-            <w:pPr>
-              <w:pStyle w:val="Normal"/>
-              <w:keepNext w:val="true"/>
-              <w:widowControl/>
-              <w:spacing w:before="0" w:after="0"/>
-              <w:rPr>
-                <w:szCs w:val="22"/>
-              </w:rPr>
-            </w:pPr>
-            <w:r>
-              <w:rPr>
-                <w:rFonts w:cs="Times New Roman"/>
-                <w:kern w:val="0"/>
-                <w:szCs w:val="22"/>
-                <w:lang w:val="pl-PL" w:bidi="ar-SA"/>
-              </w:rPr>
+              <w:br/>
               <w:t>}</w:t>
             </w:r>
           </w:p>
@@ -1136,6 +1263,42 @@
       <w:r>
         <w:rPr/>
         <w:t>JSON Schema to schemat który przedstawia strukturę dokumentu JSON. Schemat informuje jakiego typu musi być dane pole.</w:t>
+      </w:r>
+    </w:p>
+    <w:p>
+      <w:pPr>
+        <w:pStyle w:val="Normal"/>
+        <w:rPr/>
+      </w:pPr>
+      <w:r>
+        <w:rPr/>
+      </w:r>
+    </w:p>
+    <w:p>
+      <w:pPr>
+        <w:pStyle w:val="Normal"/>
+        <w:rPr/>
+      </w:pPr>
+      <w:r>
+        <w:rPr/>
+      </w:r>
+    </w:p>
+    <w:p>
+      <w:pPr>
+        <w:pStyle w:val="Normal"/>
+        <w:rPr/>
+      </w:pPr>
+      <w:r>
+        <w:rPr/>
+      </w:r>
+    </w:p>
+    <w:p>
+      <w:pPr>
+        <w:pStyle w:val="Normal"/>
+        <w:rPr/>
+      </w:pPr>
+      <w:r>
+        <w:rPr/>
       </w:r>
     </w:p>
     <w:p>
@@ -1188,7 +1351,7 @@
         <w:tblStyle w:val="Tabela-Siatka"/>
         <w:tblW w:w="9590" w:type="dxa"/>
         <w:jc w:val="start"/>
-        <w:tblInd w:w="38" w:type="dxa"/>
+        <w:tblInd w:w="151" w:type="dxa"/>
         <w:tblLayout w:type="fixed"/>
         <w:tblCellMar>
           <w:top w:w="0" w:type="dxa"/>
@@ -1211,458 +1374,716 @@
           <w:p>
             <w:pPr>
               <w:pStyle w:val="Normal"/>
-              <w:widowControl/>
-              <w:spacing w:before="0" w:after="0"/>
-              <w:rPr>
-                <w:szCs w:val="22"/>
+              <w:pBdr/>
+              <w:shd w:fill="FFFFFF" w:val="clear"/>
+              <w:jc w:val="start"/>
+              <w:rPr>
+                <w:rFonts w:ascii="Consolas" w:hAnsi="Consolas"/>
+                <w:sz w:val="20"/>
+                <w:szCs w:val="20"/>
               </w:rPr>
             </w:pPr>
             <w:r>
               <w:rPr>
-                <w:rFonts w:cs="Times New Roman"/>
-                <w:kern w:val="0"/>
-                <w:szCs w:val="22"/>
-                <w:lang w:val="pl-PL" w:bidi="ar-SA"/>
+                <w:rFonts w:ascii="Consolas" w:hAnsi="Consolas"/>
+                <w:b w:val="false"/>
+                <w:i w:val="false"/>
+                <w:color w:val="080808"/>
+                <w:sz w:val="20"/>
+                <w:szCs w:val="20"/>
               </w:rPr>
               <w:t>{</w:t>
-            </w:r>
-          </w:p>
-          <w:p>
-            <w:pPr>
-              <w:pStyle w:val="Normal"/>
-              <w:widowControl/>
-              <w:spacing w:before="0" w:after="0"/>
-              <w:rPr>
-                <w:szCs w:val="22"/>
-              </w:rPr>
-            </w:pPr>
-            <w:r>
-              <w:rPr>
-                <w:rFonts w:cs="Times New Roman"/>
-                <w:kern w:val="0"/>
-                <w:szCs w:val="22"/>
-                <w:lang w:val="pl-PL" w:bidi="ar-SA"/>
-              </w:rPr>
+              <w:br/>
               <w:t xml:space="preserve">  </w:t>
             </w:r>
             <w:r>
               <w:rPr>
-                <w:rFonts w:cs="Times New Roman"/>
-                <w:kern w:val="0"/>
-                <w:szCs w:val="22"/>
-                <w:lang w:val="pl-PL" w:bidi="ar-SA"/>
-              </w:rPr>
-              <w:t>"type": "object",</w:t>
-            </w:r>
-          </w:p>
-          <w:p>
-            <w:pPr>
-              <w:pStyle w:val="Normal"/>
-              <w:widowControl/>
-              <w:spacing w:before="0" w:after="0"/>
-              <w:rPr>
-                <w:szCs w:val="22"/>
-              </w:rPr>
-            </w:pPr>
-            <w:r>
-              <w:rPr>
-                <w:rFonts w:cs="Times New Roman"/>
-                <w:kern w:val="0"/>
-                <w:szCs w:val="22"/>
-                <w:lang w:val="pl-PL" w:bidi="ar-SA"/>
-              </w:rPr>
+                <w:rFonts w:ascii="Consolas" w:hAnsi="Consolas"/>
+                <w:b w:val="false"/>
+                <w:i w:val="false"/>
+                <w:color w:val="871094"/>
+                <w:sz w:val="20"/>
+                <w:szCs w:val="20"/>
+              </w:rPr>
+              <w:t>"type"</w:t>
+            </w:r>
+            <w:r>
+              <w:rPr>
+                <w:rFonts w:ascii="Consolas" w:hAnsi="Consolas"/>
+                <w:b w:val="false"/>
+                <w:i w:val="false"/>
+                <w:color w:val="080808"/>
+                <w:sz w:val="20"/>
+                <w:szCs w:val="20"/>
+              </w:rPr>
+              <w:t xml:space="preserve">: </w:t>
+            </w:r>
+            <w:r>
+              <w:rPr>
+                <w:rFonts w:ascii="Consolas" w:hAnsi="Consolas"/>
+                <w:b w:val="false"/>
+                <w:i w:val="false"/>
+                <w:color w:val="067D17"/>
+                <w:sz w:val="20"/>
+                <w:szCs w:val="20"/>
+              </w:rPr>
+              <w:t>"object"</w:t>
+            </w:r>
+            <w:r>
+              <w:rPr>
+                <w:rFonts w:ascii="Consolas" w:hAnsi="Consolas"/>
+                <w:b w:val="false"/>
+                <w:i w:val="false"/>
+                <w:color w:val="080808"/>
+                <w:sz w:val="20"/>
+                <w:szCs w:val="20"/>
+              </w:rPr>
+              <w:t>,</w:t>
+              <w:br/>
               <w:t xml:space="preserve">  </w:t>
             </w:r>
             <w:r>
               <w:rPr>
-                <w:rFonts w:cs="Times New Roman"/>
-                <w:kern w:val="0"/>
-                <w:szCs w:val="22"/>
-                <w:lang w:val="pl-PL" w:bidi="ar-SA"/>
-              </w:rPr>
-              <w:t>"properties": {</w:t>
-            </w:r>
-          </w:p>
-          <w:p>
-            <w:pPr>
-              <w:pStyle w:val="Normal"/>
-              <w:widowControl/>
-              <w:spacing w:before="0" w:after="0"/>
-              <w:rPr>
-                <w:szCs w:val="22"/>
-              </w:rPr>
-            </w:pPr>
-            <w:r>
-              <w:rPr>
-                <w:rFonts w:cs="Times New Roman"/>
-                <w:kern w:val="0"/>
-                <w:szCs w:val="22"/>
-                <w:lang w:val="pl-PL" w:bidi="ar-SA"/>
-              </w:rPr>
+                <w:rFonts w:ascii="Consolas" w:hAnsi="Consolas"/>
+                <w:b w:val="false"/>
+                <w:i w:val="false"/>
+                <w:color w:val="871094"/>
+                <w:sz w:val="20"/>
+                <w:szCs w:val="20"/>
+              </w:rPr>
+              <w:t>"properties"</w:t>
+            </w:r>
+            <w:r>
+              <w:rPr>
+                <w:rFonts w:ascii="Consolas" w:hAnsi="Consolas"/>
+                <w:b w:val="false"/>
+                <w:i w:val="false"/>
+                <w:color w:val="080808"/>
+                <w:sz w:val="20"/>
+                <w:szCs w:val="20"/>
+              </w:rPr>
+              <w:t>: {</w:t>
+              <w:br/>
               <w:t xml:space="preserve">    </w:t>
             </w:r>
             <w:r>
               <w:rPr>
-                <w:rFonts w:cs="Times New Roman"/>
-                <w:kern w:val="0"/>
-                <w:szCs w:val="22"/>
-                <w:lang w:val="pl-PL" w:bidi="ar-SA"/>
-              </w:rPr>
-              <w:t>"first_name": { "type": "string" },</w:t>
-            </w:r>
-          </w:p>
-          <w:p>
-            <w:pPr>
-              <w:pStyle w:val="Normal"/>
-              <w:widowControl/>
-              <w:spacing w:before="0" w:after="0"/>
-              <w:rPr>
-                <w:szCs w:val="22"/>
-              </w:rPr>
-            </w:pPr>
-            <w:r>
-              <w:rPr>
-                <w:rFonts w:cs="Times New Roman"/>
-                <w:kern w:val="0"/>
-                <w:szCs w:val="22"/>
-                <w:lang w:val="pl-PL" w:bidi="ar-SA"/>
-              </w:rPr>
+                <w:rFonts w:ascii="Consolas" w:hAnsi="Consolas"/>
+                <w:b w:val="false"/>
+                <w:i w:val="false"/>
+                <w:color w:val="871094"/>
+                <w:sz w:val="20"/>
+                <w:szCs w:val="20"/>
+              </w:rPr>
+              <w:t>"first_name"</w:t>
+            </w:r>
+            <w:r>
+              <w:rPr>
+                <w:rFonts w:ascii="Consolas" w:hAnsi="Consolas"/>
+                <w:b w:val="false"/>
+                <w:i w:val="false"/>
+                <w:color w:val="080808"/>
+                <w:sz w:val="20"/>
+                <w:szCs w:val="20"/>
+              </w:rPr>
+              <w:t xml:space="preserve">: { </w:t>
+            </w:r>
+            <w:r>
+              <w:rPr>
+                <w:rFonts w:ascii="Consolas" w:hAnsi="Consolas"/>
+                <w:b w:val="false"/>
+                <w:i w:val="false"/>
+                <w:color w:val="871094"/>
+                <w:sz w:val="20"/>
+                <w:szCs w:val="20"/>
+              </w:rPr>
+              <w:t>"type"</w:t>
+            </w:r>
+            <w:r>
+              <w:rPr>
+                <w:rFonts w:ascii="Consolas" w:hAnsi="Consolas"/>
+                <w:b w:val="false"/>
+                <w:i w:val="false"/>
+                <w:color w:val="080808"/>
+                <w:sz w:val="20"/>
+                <w:szCs w:val="20"/>
+              </w:rPr>
+              <w:t xml:space="preserve">: </w:t>
+            </w:r>
+            <w:r>
+              <w:rPr>
+                <w:rFonts w:ascii="Consolas" w:hAnsi="Consolas"/>
+                <w:b w:val="false"/>
+                <w:i w:val="false"/>
+                <w:color w:val="067D17"/>
+                <w:sz w:val="20"/>
+                <w:szCs w:val="20"/>
+              </w:rPr>
+              <w:t xml:space="preserve">"string" </w:t>
+            </w:r>
+            <w:r>
+              <w:rPr>
+                <w:rFonts w:ascii="Consolas" w:hAnsi="Consolas"/>
+                <w:b w:val="false"/>
+                <w:i w:val="false"/>
+                <w:color w:val="080808"/>
+                <w:sz w:val="20"/>
+                <w:szCs w:val="20"/>
+              </w:rPr>
+              <w:t>},</w:t>
+              <w:br/>
               <w:t xml:space="preserve">    </w:t>
             </w:r>
             <w:r>
               <w:rPr>
-                <w:rFonts w:cs="Times New Roman"/>
-                <w:kern w:val="0"/>
-                <w:szCs w:val="22"/>
-                <w:lang w:val="pl-PL" w:bidi="ar-SA"/>
-              </w:rPr>
-              <w:t>"last_name": { "type": "string" },</w:t>
-            </w:r>
-          </w:p>
-          <w:p>
-            <w:pPr>
-              <w:pStyle w:val="Normal"/>
-              <w:widowControl/>
-              <w:spacing w:before="0" w:after="0"/>
-              <w:rPr>
-                <w:szCs w:val="22"/>
-              </w:rPr>
-            </w:pPr>
-            <w:r>
-              <w:rPr>
-                <w:rFonts w:cs="Times New Roman"/>
-                <w:kern w:val="0"/>
-                <w:szCs w:val="22"/>
-                <w:lang w:val="pl-PL" w:bidi="ar-SA"/>
-              </w:rPr>
+                <w:rFonts w:ascii="Consolas" w:hAnsi="Consolas"/>
+                <w:b w:val="false"/>
+                <w:i w:val="false"/>
+                <w:color w:val="871094"/>
+                <w:sz w:val="20"/>
+                <w:szCs w:val="20"/>
+              </w:rPr>
+              <w:t>"last_name"</w:t>
+            </w:r>
+            <w:r>
+              <w:rPr>
+                <w:rFonts w:ascii="Consolas" w:hAnsi="Consolas"/>
+                <w:b w:val="false"/>
+                <w:i w:val="false"/>
+                <w:color w:val="080808"/>
+                <w:sz w:val="20"/>
+                <w:szCs w:val="20"/>
+              </w:rPr>
+              <w:t xml:space="preserve">: { </w:t>
+            </w:r>
+            <w:r>
+              <w:rPr>
+                <w:rFonts w:ascii="Consolas" w:hAnsi="Consolas"/>
+                <w:b w:val="false"/>
+                <w:i w:val="false"/>
+                <w:color w:val="871094"/>
+                <w:sz w:val="20"/>
+                <w:szCs w:val="20"/>
+              </w:rPr>
+              <w:t>"type"</w:t>
+            </w:r>
+            <w:r>
+              <w:rPr>
+                <w:rFonts w:ascii="Consolas" w:hAnsi="Consolas"/>
+                <w:b w:val="false"/>
+                <w:i w:val="false"/>
+                <w:color w:val="080808"/>
+                <w:sz w:val="20"/>
+                <w:szCs w:val="20"/>
+              </w:rPr>
+              <w:t xml:space="preserve">: </w:t>
+            </w:r>
+            <w:r>
+              <w:rPr>
+                <w:rFonts w:ascii="Consolas" w:hAnsi="Consolas"/>
+                <w:b w:val="false"/>
+                <w:i w:val="false"/>
+                <w:color w:val="067D17"/>
+                <w:sz w:val="20"/>
+                <w:szCs w:val="20"/>
+              </w:rPr>
+              <w:t xml:space="preserve">"string" </w:t>
+            </w:r>
+            <w:r>
+              <w:rPr>
+                <w:rFonts w:ascii="Consolas" w:hAnsi="Consolas"/>
+                <w:b w:val="false"/>
+                <w:i w:val="false"/>
+                <w:color w:val="080808"/>
+                <w:sz w:val="20"/>
+                <w:szCs w:val="20"/>
+              </w:rPr>
+              <w:t>},</w:t>
+              <w:br/>
               <w:t xml:space="preserve">    </w:t>
             </w:r>
             <w:r>
               <w:rPr>
-                <w:rFonts w:cs="Times New Roman"/>
-                <w:kern w:val="0"/>
-                <w:szCs w:val="22"/>
-                <w:lang w:val="pl-PL" w:bidi="ar-SA"/>
-              </w:rPr>
-              <w:t>"birthday": { "type": "string", "format": "date" },</w:t>
-            </w:r>
-          </w:p>
-          <w:p>
-            <w:pPr>
-              <w:pStyle w:val="Normal"/>
-              <w:widowControl/>
-              <w:spacing w:before="0" w:after="0"/>
-              <w:rPr>
-                <w:szCs w:val="22"/>
-              </w:rPr>
-            </w:pPr>
-            <w:r>
-              <w:rPr>
-                <w:rFonts w:cs="Times New Roman"/>
-                <w:kern w:val="0"/>
-                <w:szCs w:val="22"/>
-                <w:lang w:val="pl-PL" w:bidi="ar-SA"/>
-              </w:rPr>
+                <w:rFonts w:ascii="Consolas" w:hAnsi="Consolas"/>
+                <w:b w:val="false"/>
+                <w:i w:val="false"/>
+                <w:color w:val="871094"/>
+                <w:sz w:val="20"/>
+                <w:szCs w:val="20"/>
+              </w:rPr>
+              <w:t>"birthday"</w:t>
+            </w:r>
+            <w:r>
+              <w:rPr>
+                <w:rFonts w:ascii="Consolas" w:hAnsi="Consolas"/>
+                <w:b w:val="false"/>
+                <w:i w:val="false"/>
+                <w:color w:val="080808"/>
+                <w:sz w:val="20"/>
+                <w:szCs w:val="20"/>
+              </w:rPr>
+              <w:t xml:space="preserve">: { </w:t>
+            </w:r>
+            <w:r>
+              <w:rPr>
+                <w:rFonts w:ascii="Consolas" w:hAnsi="Consolas"/>
+                <w:b w:val="false"/>
+                <w:i w:val="false"/>
+                <w:color w:val="871094"/>
+                <w:sz w:val="20"/>
+                <w:szCs w:val="20"/>
+              </w:rPr>
+              <w:t>"type"</w:t>
+            </w:r>
+            <w:r>
+              <w:rPr>
+                <w:rFonts w:ascii="Consolas" w:hAnsi="Consolas"/>
+                <w:b w:val="false"/>
+                <w:i w:val="false"/>
+                <w:color w:val="080808"/>
+                <w:sz w:val="20"/>
+                <w:szCs w:val="20"/>
+              </w:rPr>
+              <w:t xml:space="preserve">: </w:t>
+            </w:r>
+            <w:r>
+              <w:rPr>
+                <w:rFonts w:ascii="Consolas" w:hAnsi="Consolas"/>
+                <w:b w:val="false"/>
+                <w:i w:val="false"/>
+                <w:color w:val="067D17"/>
+                <w:sz w:val="20"/>
+                <w:szCs w:val="20"/>
+              </w:rPr>
+              <w:t>"string"</w:t>
+            </w:r>
+            <w:r>
+              <w:rPr>
+                <w:rFonts w:ascii="Consolas" w:hAnsi="Consolas"/>
+                <w:b w:val="false"/>
+                <w:i w:val="false"/>
+                <w:color w:val="080808"/>
+                <w:sz w:val="20"/>
+                <w:szCs w:val="20"/>
+              </w:rPr>
+              <w:t xml:space="preserve">, </w:t>
+            </w:r>
+            <w:r>
+              <w:rPr>
+                <w:rFonts w:ascii="Consolas" w:hAnsi="Consolas"/>
+                <w:b w:val="false"/>
+                <w:i w:val="false"/>
+                <w:color w:val="871094"/>
+                <w:sz w:val="20"/>
+                <w:szCs w:val="20"/>
+              </w:rPr>
+              <w:t>"format"</w:t>
+            </w:r>
+            <w:r>
+              <w:rPr>
+                <w:rFonts w:ascii="Consolas" w:hAnsi="Consolas"/>
+                <w:b w:val="false"/>
+                <w:i w:val="false"/>
+                <w:color w:val="080808"/>
+                <w:sz w:val="20"/>
+                <w:szCs w:val="20"/>
+              </w:rPr>
+              <w:t xml:space="preserve">: </w:t>
+            </w:r>
+            <w:r>
+              <w:rPr>
+                <w:rFonts w:ascii="Consolas" w:hAnsi="Consolas"/>
+                <w:b w:val="false"/>
+                <w:i w:val="false"/>
+                <w:color w:val="067D17"/>
+                <w:sz w:val="20"/>
+                <w:szCs w:val="20"/>
+              </w:rPr>
+              <w:t xml:space="preserve">"date" </w:t>
+            </w:r>
+            <w:r>
+              <w:rPr>
+                <w:rFonts w:ascii="Consolas" w:hAnsi="Consolas"/>
+                <w:b w:val="false"/>
+                <w:i w:val="false"/>
+                <w:color w:val="080808"/>
+                <w:sz w:val="20"/>
+                <w:szCs w:val="20"/>
+              </w:rPr>
+              <w:t>},</w:t>
+              <w:br/>
               <w:t xml:space="preserve">    </w:t>
             </w:r>
             <w:r>
               <w:rPr>
-                <w:rFonts w:cs="Times New Roman"/>
-                <w:kern w:val="0"/>
-                <w:szCs w:val="22"/>
-                <w:lang w:val="pl-PL" w:bidi="ar-SA"/>
-              </w:rPr>
-              <w:t>"address": {</w:t>
-            </w:r>
-          </w:p>
-          <w:p>
-            <w:pPr>
-              <w:pStyle w:val="Normal"/>
-              <w:widowControl/>
-              <w:spacing w:before="0" w:after="0"/>
-              <w:rPr>
-                <w:szCs w:val="22"/>
-              </w:rPr>
-            </w:pPr>
-            <w:r>
-              <w:rPr>
-                <w:rFonts w:cs="Times New Roman"/>
-                <w:kern w:val="0"/>
-                <w:szCs w:val="22"/>
-                <w:lang w:val="pl-PL" w:bidi="ar-SA"/>
-              </w:rPr>
-              <w:t xml:space="preserve">       </w:t>
-            </w:r>
-            <w:r>
-              <w:rPr>
-                <w:rFonts w:cs="Times New Roman"/>
-                <w:kern w:val="0"/>
-                <w:szCs w:val="22"/>
-                <w:lang w:val="pl-PL" w:bidi="ar-SA"/>
-              </w:rPr>
-              <w:t>"type": "object",</w:t>
-            </w:r>
-          </w:p>
-          <w:p>
-            <w:pPr>
-              <w:pStyle w:val="Normal"/>
-              <w:widowControl/>
-              <w:spacing w:before="0" w:after="0"/>
-              <w:rPr>
-                <w:szCs w:val="22"/>
-              </w:rPr>
-            </w:pPr>
-            <w:r>
-              <w:rPr>
-                <w:rFonts w:cs="Times New Roman"/>
-                <w:kern w:val="0"/>
-                <w:szCs w:val="22"/>
-                <w:lang w:val="pl-PL" w:bidi="ar-SA"/>
-              </w:rPr>
-              <w:t xml:space="preserve">       </w:t>
-            </w:r>
-            <w:r>
-              <w:rPr>
-                <w:rFonts w:cs="Times New Roman"/>
-                <w:kern w:val="0"/>
-                <w:szCs w:val="22"/>
-                <w:lang w:val="pl-PL" w:bidi="ar-SA"/>
-              </w:rPr>
-              <w:t>"properties": {</w:t>
-            </w:r>
-          </w:p>
-          <w:p>
-            <w:pPr>
-              <w:pStyle w:val="Normal"/>
-              <w:widowControl/>
-              <w:spacing w:before="0" w:after="0"/>
-              <w:rPr>
-                <w:szCs w:val="22"/>
-              </w:rPr>
-            </w:pPr>
-            <w:r>
-              <w:rPr>
-                <w:rFonts w:cs="Times New Roman"/>
-                <w:kern w:val="0"/>
-                <w:szCs w:val="22"/>
-                <w:lang w:val="pl-PL" w:bidi="ar-SA"/>
-              </w:rPr>
-              <w:t xml:space="preserve">         </w:t>
-            </w:r>
-            <w:r>
-              <w:rPr>
-                <w:rFonts w:cs="Times New Roman"/>
-                <w:kern w:val="0"/>
-                <w:szCs w:val="22"/>
-                <w:lang w:val="pl-PL" w:bidi="ar-SA"/>
-              </w:rPr>
-              <w:t>"street_address": { "type": "string" },</w:t>
-            </w:r>
-          </w:p>
-          <w:p>
-            <w:pPr>
-              <w:pStyle w:val="Normal"/>
-              <w:widowControl/>
-              <w:spacing w:before="0" w:after="0"/>
-              <w:rPr>
-                <w:szCs w:val="22"/>
-              </w:rPr>
-            </w:pPr>
-            <w:r>
-              <w:rPr>
-                <w:rFonts w:cs="Times New Roman"/>
-                <w:kern w:val="0"/>
-                <w:szCs w:val="22"/>
-                <w:lang w:val="pl-PL" w:bidi="ar-SA"/>
-              </w:rPr>
-              <w:t xml:space="preserve">         </w:t>
-            </w:r>
-            <w:r>
-              <w:rPr>
-                <w:rFonts w:cs="Times New Roman"/>
-                <w:kern w:val="0"/>
-                <w:szCs w:val="22"/>
-                <w:lang w:val="pl-PL" w:bidi="ar-SA"/>
-              </w:rPr>
-              <w:t>"city": { "type": "string" },</w:t>
-            </w:r>
-          </w:p>
-          <w:p>
-            <w:pPr>
-              <w:pStyle w:val="Normal"/>
-              <w:widowControl/>
-              <w:spacing w:before="0" w:after="0"/>
-              <w:rPr>
-                <w:szCs w:val="22"/>
-              </w:rPr>
-            </w:pPr>
-            <w:r>
-              <w:rPr>
-                <w:rFonts w:cs="Times New Roman"/>
-                <w:kern w:val="0"/>
-                <w:szCs w:val="22"/>
-                <w:lang w:val="pl-PL" w:bidi="ar-SA"/>
-              </w:rPr>
-              <w:t xml:space="preserve">         </w:t>
-            </w:r>
-            <w:r>
-              <w:rPr>
-                <w:rFonts w:cs="Times New Roman"/>
-                <w:kern w:val="0"/>
-                <w:szCs w:val="22"/>
-                <w:lang w:val="pl-PL" w:bidi="ar-SA"/>
-              </w:rPr>
-              <w:t>"state": { "type": "string" },</w:t>
-            </w:r>
-          </w:p>
-          <w:p>
-            <w:pPr>
-              <w:pStyle w:val="Normal"/>
-              <w:widowControl/>
-              <w:spacing w:before="0" w:after="0"/>
-              <w:rPr>
-                <w:szCs w:val="22"/>
-              </w:rPr>
-            </w:pPr>
-            <w:r>
-              <w:rPr>
-                <w:rFonts w:cs="Times New Roman"/>
-                <w:kern w:val="0"/>
-                <w:szCs w:val="22"/>
-                <w:lang w:val="pl-PL" w:bidi="ar-SA"/>
-              </w:rPr>
-              <w:t xml:space="preserve">         </w:t>
-            </w:r>
-            <w:r>
-              <w:rPr>
-                <w:rFonts w:cs="Times New Roman"/>
-                <w:kern w:val="0"/>
-                <w:szCs w:val="22"/>
-                <w:lang w:val="pl-PL" w:bidi="ar-SA"/>
-              </w:rPr>
-              <w:t>"country": { "type" : "string" }</w:t>
-            </w:r>
-          </w:p>
-          <w:p>
-            <w:pPr>
-              <w:pStyle w:val="Normal"/>
-              <w:widowControl/>
-              <w:spacing w:before="0" w:after="0"/>
-              <w:rPr>
-                <w:szCs w:val="22"/>
-              </w:rPr>
-            </w:pPr>
-            <w:r>
-              <w:rPr>
-                <w:rFonts w:cs="Times New Roman"/>
-                <w:kern w:val="0"/>
-                <w:szCs w:val="22"/>
-                <w:lang w:val="pl-PL" w:bidi="ar-SA"/>
-              </w:rPr>
-              <w:t xml:space="preserve">       </w:t>
-            </w:r>
-            <w:r>
-              <w:rPr>
-                <w:rFonts w:cs="Times New Roman"/>
-                <w:kern w:val="0"/>
-                <w:szCs w:val="22"/>
-                <w:lang w:val="pl-PL" w:bidi="ar-SA"/>
+                <w:rFonts w:ascii="Consolas" w:hAnsi="Consolas"/>
+                <w:b w:val="false"/>
+                <w:i w:val="false"/>
+                <w:color w:val="871094"/>
+                <w:sz w:val="20"/>
+                <w:szCs w:val="20"/>
+              </w:rPr>
+              <w:t>"address"</w:t>
+            </w:r>
+            <w:r>
+              <w:rPr>
+                <w:rFonts w:ascii="Consolas" w:hAnsi="Consolas"/>
+                <w:b w:val="false"/>
+                <w:i w:val="false"/>
+                <w:color w:val="080808"/>
+                <w:sz w:val="20"/>
+                <w:szCs w:val="20"/>
+              </w:rPr>
+              <w:t>: {</w:t>
+              <w:br/>
+              <w:t xml:space="preserve">      </w:t>
+            </w:r>
+            <w:r>
+              <w:rPr>
+                <w:rFonts w:ascii="Consolas" w:hAnsi="Consolas"/>
+                <w:b w:val="false"/>
+                <w:i w:val="false"/>
+                <w:color w:val="871094"/>
+                <w:sz w:val="20"/>
+                <w:szCs w:val="20"/>
+              </w:rPr>
+              <w:t>"type"</w:t>
+            </w:r>
+            <w:r>
+              <w:rPr>
+                <w:rFonts w:ascii="Consolas" w:hAnsi="Consolas"/>
+                <w:b w:val="false"/>
+                <w:i w:val="false"/>
+                <w:color w:val="080808"/>
+                <w:sz w:val="20"/>
+                <w:szCs w:val="20"/>
+              </w:rPr>
+              <w:t xml:space="preserve">: </w:t>
+            </w:r>
+            <w:r>
+              <w:rPr>
+                <w:rFonts w:ascii="Consolas" w:hAnsi="Consolas"/>
+                <w:b w:val="false"/>
+                <w:i w:val="false"/>
+                <w:color w:val="067D17"/>
+                <w:sz w:val="20"/>
+                <w:szCs w:val="20"/>
+              </w:rPr>
+              <w:t>"object"</w:t>
+            </w:r>
+            <w:r>
+              <w:rPr>
+                <w:rFonts w:ascii="Consolas" w:hAnsi="Consolas"/>
+                <w:b w:val="false"/>
+                <w:i w:val="false"/>
+                <w:color w:val="080808"/>
+                <w:sz w:val="20"/>
+                <w:szCs w:val="20"/>
+              </w:rPr>
+              <w:t>,</w:t>
+              <w:br/>
+              <w:t xml:space="preserve">      </w:t>
+            </w:r>
+            <w:r>
+              <w:rPr>
+                <w:rFonts w:ascii="Consolas" w:hAnsi="Consolas"/>
+                <w:b w:val="false"/>
+                <w:i w:val="false"/>
+                <w:color w:val="871094"/>
+                <w:sz w:val="20"/>
+                <w:szCs w:val="20"/>
+              </w:rPr>
+              <w:t>"properties"</w:t>
+            </w:r>
+            <w:r>
+              <w:rPr>
+                <w:rFonts w:ascii="Consolas" w:hAnsi="Consolas"/>
+                <w:b w:val="false"/>
+                <w:i w:val="false"/>
+                <w:color w:val="080808"/>
+                <w:sz w:val="20"/>
+                <w:szCs w:val="20"/>
+              </w:rPr>
+              <w:t>: {</w:t>
+              <w:br/>
+              <w:t xml:space="preserve">        </w:t>
+            </w:r>
+            <w:r>
+              <w:rPr>
+                <w:rFonts w:ascii="Consolas" w:hAnsi="Consolas"/>
+                <w:b w:val="false"/>
+                <w:i w:val="false"/>
+                <w:color w:val="871094"/>
+                <w:sz w:val="20"/>
+                <w:szCs w:val="20"/>
+              </w:rPr>
+              <w:t>"street_address"</w:t>
+            </w:r>
+            <w:r>
+              <w:rPr>
+                <w:rFonts w:ascii="Consolas" w:hAnsi="Consolas"/>
+                <w:b w:val="false"/>
+                <w:i w:val="false"/>
+                <w:color w:val="080808"/>
+                <w:sz w:val="20"/>
+                <w:szCs w:val="20"/>
+              </w:rPr>
+              <w:t xml:space="preserve">: { </w:t>
+            </w:r>
+            <w:r>
+              <w:rPr>
+                <w:rFonts w:ascii="Consolas" w:hAnsi="Consolas"/>
+                <w:b w:val="false"/>
+                <w:i w:val="false"/>
+                <w:color w:val="871094"/>
+                <w:sz w:val="20"/>
+                <w:szCs w:val="20"/>
+              </w:rPr>
+              <w:t>"type"</w:t>
+            </w:r>
+            <w:r>
+              <w:rPr>
+                <w:rFonts w:ascii="Consolas" w:hAnsi="Consolas"/>
+                <w:b w:val="false"/>
+                <w:i w:val="false"/>
+                <w:color w:val="080808"/>
+                <w:sz w:val="20"/>
+                <w:szCs w:val="20"/>
+              </w:rPr>
+              <w:t xml:space="preserve">: </w:t>
+            </w:r>
+            <w:r>
+              <w:rPr>
+                <w:rFonts w:ascii="Consolas" w:hAnsi="Consolas"/>
+                <w:b w:val="false"/>
+                <w:i w:val="false"/>
+                <w:color w:val="067D17"/>
+                <w:sz w:val="20"/>
+                <w:szCs w:val="20"/>
+              </w:rPr>
+              <w:t xml:space="preserve">"string" </w:t>
+            </w:r>
+            <w:r>
+              <w:rPr>
+                <w:rFonts w:ascii="Consolas" w:hAnsi="Consolas"/>
+                <w:b w:val="false"/>
+                <w:i w:val="false"/>
+                <w:color w:val="080808"/>
+                <w:sz w:val="20"/>
+                <w:szCs w:val="20"/>
+              </w:rPr>
+              <w:t>},</w:t>
+              <w:br/>
+              <w:t xml:space="preserve">        </w:t>
+            </w:r>
+            <w:r>
+              <w:rPr>
+                <w:rFonts w:ascii="Consolas" w:hAnsi="Consolas"/>
+                <w:b w:val="false"/>
+                <w:i w:val="false"/>
+                <w:color w:val="871094"/>
+                <w:sz w:val="20"/>
+                <w:szCs w:val="20"/>
+              </w:rPr>
+              <w:t>"city"</w:t>
+            </w:r>
+            <w:r>
+              <w:rPr>
+                <w:rFonts w:ascii="Consolas" w:hAnsi="Consolas"/>
+                <w:b w:val="false"/>
+                <w:i w:val="false"/>
+                <w:color w:val="080808"/>
+                <w:sz w:val="20"/>
+                <w:szCs w:val="20"/>
+              </w:rPr>
+              <w:t xml:space="preserve">: { </w:t>
+            </w:r>
+            <w:r>
+              <w:rPr>
+                <w:rFonts w:ascii="Consolas" w:hAnsi="Consolas"/>
+                <w:b w:val="false"/>
+                <w:i w:val="false"/>
+                <w:color w:val="871094"/>
+                <w:sz w:val="20"/>
+                <w:szCs w:val="20"/>
+              </w:rPr>
+              <w:t>"type"</w:t>
+            </w:r>
+            <w:r>
+              <w:rPr>
+                <w:rFonts w:ascii="Consolas" w:hAnsi="Consolas"/>
+                <w:b w:val="false"/>
+                <w:i w:val="false"/>
+                <w:color w:val="080808"/>
+                <w:sz w:val="20"/>
+                <w:szCs w:val="20"/>
+              </w:rPr>
+              <w:t xml:space="preserve">: </w:t>
+            </w:r>
+            <w:r>
+              <w:rPr>
+                <w:rFonts w:ascii="Consolas" w:hAnsi="Consolas"/>
+                <w:b w:val="false"/>
+                <w:i w:val="false"/>
+                <w:color w:val="067D17"/>
+                <w:sz w:val="20"/>
+                <w:szCs w:val="20"/>
+              </w:rPr>
+              <w:t xml:space="preserve">"string" </w:t>
+            </w:r>
+            <w:r>
+              <w:rPr>
+                <w:rFonts w:ascii="Consolas" w:hAnsi="Consolas"/>
+                <w:b w:val="false"/>
+                <w:i w:val="false"/>
+                <w:color w:val="080808"/>
+                <w:sz w:val="20"/>
+                <w:szCs w:val="20"/>
+              </w:rPr>
+              <w:t>},</w:t>
+              <w:br/>
+              <w:t xml:space="preserve">        </w:t>
+            </w:r>
+            <w:r>
+              <w:rPr>
+                <w:rFonts w:ascii="Consolas" w:hAnsi="Consolas"/>
+                <w:b w:val="false"/>
+                <w:i w:val="false"/>
+                <w:color w:val="871094"/>
+                <w:sz w:val="20"/>
+                <w:szCs w:val="20"/>
+              </w:rPr>
+              <w:t>"state"</w:t>
+            </w:r>
+            <w:r>
+              <w:rPr>
+                <w:rFonts w:ascii="Consolas" w:hAnsi="Consolas"/>
+                <w:b w:val="false"/>
+                <w:i w:val="false"/>
+                <w:color w:val="080808"/>
+                <w:sz w:val="20"/>
+                <w:szCs w:val="20"/>
+              </w:rPr>
+              <w:t xml:space="preserve">: { </w:t>
+            </w:r>
+            <w:r>
+              <w:rPr>
+                <w:rFonts w:ascii="Consolas" w:hAnsi="Consolas"/>
+                <w:b w:val="false"/>
+                <w:i w:val="false"/>
+                <w:color w:val="871094"/>
+                <w:sz w:val="20"/>
+                <w:szCs w:val="20"/>
+              </w:rPr>
+              <w:t>"type"</w:t>
+            </w:r>
+            <w:r>
+              <w:rPr>
+                <w:rFonts w:ascii="Consolas" w:hAnsi="Consolas"/>
+                <w:b w:val="false"/>
+                <w:i w:val="false"/>
+                <w:color w:val="080808"/>
+                <w:sz w:val="20"/>
+                <w:szCs w:val="20"/>
+              </w:rPr>
+              <w:t xml:space="preserve">: </w:t>
+            </w:r>
+            <w:r>
+              <w:rPr>
+                <w:rFonts w:ascii="Consolas" w:hAnsi="Consolas"/>
+                <w:b w:val="false"/>
+                <w:i w:val="false"/>
+                <w:color w:val="067D17"/>
+                <w:sz w:val="20"/>
+                <w:szCs w:val="20"/>
+              </w:rPr>
+              <w:t xml:space="preserve">"string" </w:t>
+            </w:r>
+            <w:r>
+              <w:rPr>
+                <w:rFonts w:ascii="Consolas" w:hAnsi="Consolas"/>
+                <w:b w:val="false"/>
+                <w:i w:val="false"/>
+                <w:color w:val="080808"/>
+                <w:sz w:val="20"/>
+                <w:szCs w:val="20"/>
+              </w:rPr>
+              <w:t>},</w:t>
+              <w:br/>
+              <w:t xml:space="preserve">        </w:t>
+            </w:r>
+            <w:r>
+              <w:rPr>
+                <w:rFonts w:ascii="Consolas" w:hAnsi="Consolas"/>
+                <w:b w:val="false"/>
+                <w:i w:val="false"/>
+                <w:color w:val="871094"/>
+                <w:sz w:val="20"/>
+                <w:szCs w:val="20"/>
+              </w:rPr>
+              <w:t>"country"</w:t>
+            </w:r>
+            <w:r>
+              <w:rPr>
+                <w:rFonts w:ascii="Consolas" w:hAnsi="Consolas"/>
+                <w:b w:val="false"/>
+                <w:i w:val="false"/>
+                <w:color w:val="080808"/>
+                <w:sz w:val="20"/>
+                <w:szCs w:val="20"/>
+              </w:rPr>
+              <w:t xml:space="preserve">: { </w:t>
+            </w:r>
+            <w:r>
+              <w:rPr>
+                <w:rFonts w:ascii="Consolas" w:hAnsi="Consolas"/>
+                <w:b w:val="false"/>
+                <w:i w:val="false"/>
+                <w:color w:val="871094"/>
+                <w:sz w:val="20"/>
+                <w:szCs w:val="20"/>
+              </w:rPr>
+              <w:t xml:space="preserve">"type" </w:t>
+            </w:r>
+            <w:r>
+              <w:rPr>
+                <w:rFonts w:ascii="Consolas" w:hAnsi="Consolas"/>
+                <w:b w:val="false"/>
+                <w:i w:val="false"/>
+                <w:color w:val="080808"/>
+                <w:sz w:val="20"/>
+                <w:szCs w:val="20"/>
+              </w:rPr>
+              <w:t xml:space="preserve">: </w:t>
+            </w:r>
+            <w:r>
+              <w:rPr>
+                <w:rFonts w:ascii="Consolas" w:hAnsi="Consolas"/>
+                <w:b w:val="false"/>
+                <w:i w:val="false"/>
+                <w:color w:val="067D17"/>
+                <w:sz w:val="20"/>
+                <w:szCs w:val="20"/>
+              </w:rPr>
+              <w:t xml:space="preserve">"string" </w:t>
+            </w:r>
+            <w:r>
+              <w:rPr>
+                <w:rFonts w:ascii="Consolas" w:hAnsi="Consolas"/>
+                <w:b w:val="false"/>
+                <w:i w:val="false"/>
+                <w:color w:val="080808"/>
+                <w:sz w:val="20"/>
+                <w:szCs w:val="20"/>
               </w:rPr>
               <w:t>}</w:t>
-            </w:r>
-          </w:p>
-          <w:p>
-            <w:pPr>
-              <w:pStyle w:val="Normal"/>
-              <w:widowControl/>
-              <w:spacing w:before="0" w:after="0"/>
-              <w:rPr>
-                <w:szCs w:val="22"/>
-              </w:rPr>
-            </w:pPr>
-            <w:r>
-              <w:rPr>
-                <w:rFonts w:cs="Times New Roman"/>
-                <w:kern w:val="0"/>
-                <w:szCs w:val="22"/>
-                <w:lang w:val="pl-PL" w:bidi="ar-SA"/>
-              </w:rPr>
-              <w:t xml:space="preserve">    </w:t>
-            </w:r>
-            <w:r>
-              <w:rPr>
-                <w:rFonts w:cs="Times New Roman"/>
-                <w:kern w:val="0"/>
-                <w:szCs w:val="22"/>
-                <w:lang w:val="pl-PL" w:bidi="ar-SA"/>
-              </w:rPr>
-              <w:t>}</w:t>
-            </w:r>
-          </w:p>
-          <w:p>
-            <w:pPr>
-              <w:pStyle w:val="Normal"/>
-              <w:widowControl/>
-              <w:spacing w:before="0" w:after="0"/>
-              <w:rPr>
-                <w:szCs w:val="22"/>
-              </w:rPr>
-            </w:pPr>
-            <w:r>
-              <w:rPr>
-                <w:rFonts w:cs="Times New Roman"/>
-                <w:kern w:val="0"/>
-                <w:szCs w:val="22"/>
-                <w:lang w:val="pl-PL" w:bidi="ar-SA"/>
-              </w:rPr>
-              <w:t xml:space="preserve">  </w:t>
-            </w:r>
-            <w:r>
-              <w:rPr>
-                <w:rFonts w:cs="Times New Roman"/>
-                <w:kern w:val="0"/>
-                <w:szCs w:val="22"/>
-                <w:lang w:val="pl-PL" w:bidi="ar-SA"/>
-              </w:rPr>
-              <w:t>}</w:t>
-            </w:r>
-          </w:p>
-          <w:p>
-            <w:pPr>
-              <w:pStyle w:val="Normal"/>
-              <w:widowControl/>
-              <w:spacing w:before="0" w:after="0"/>
-              <w:rPr>
-                <w:szCs w:val="22"/>
-              </w:rPr>
-            </w:pPr>
-            <w:r>
-              <w:rPr>
-                <w:rFonts w:cs="Times New Roman"/>
-                <w:kern w:val="0"/>
-                <w:szCs w:val="22"/>
-                <w:lang w:val="pl-PL" w:bidi="ar-SA"/>
-              </w:rPr>
+              <w:br/>
+              <w:t xml:space="preserve">      }</w:t>
+              <w:br/>
+              <w:t xml:space="preserve">    }</w:t>
+              <w:br/>
+              <w:t xml:space="preserve">  }</w:t>
+              <w:br/>
               <w:t>}</w:t>
             </w:r>
           </w:p>
@@ -1767,11 +2188,47 @@
         <w:rPr/>
       </w:r>
     </w:p>
+    <w:p>
+      <w:pPr>
+        <w:pStyle w:val="Tabela"/>
+        <w:keepNext w:val="true"/>
+        <w:jc w:val="center"/>
+        <w:rPr/>
+      </w:pPr>
+      <w:r>
+        <w:rPr/>
+        <w:t xml:space="preserve">Tabela </w:t>
+      </w:r>
+      <w:r>
+        <w:rPr/>
+        <w:fldChar w:fldCharType="begin"/>
+      </w:r>
+      <w:r>
+        <w:rPr/>
+        <w:instrText xml:space="preserve"> SEQ Tabela \* ARABIC </w:instrText>
+      </w:r>
+      <w:r>
+        <w:rPr/>
+        <w:fldChar w:fldCharType="separate"/>
+      </w:r>
+      <w:r>
+        <w:rPr/>
+        <w:t>1</w:t>
+      </w:r>
+      <w:r>
+        <w:rPr/>
+        <w:fldChar w:fldCharType="end"/>
+      </w:r>
+      <w:r>
+        <w:rPr/>
+        <w:t>: Mapowanie typów JSON Schema na język Java</w:t>
+      </w:r>
+    </w:p>
     <w:tbl>
       <w:tblPr>
         <w:tblW w:w="5000" w:type="pct"/>
         <w:jc w:val="start"/>
-        <w:tblInd w:w="-5" w:type="dxa"/>
+        <w:tblInd w:w="55" w:type="dxa"/>
         <w:tblLayout w:type="fixed"/>
         <w:tblCellMar>
           <w:top w:w="55" w:type="dxa"/>
@@ -1801,14 +2258,15 @@
               <w:pStyle w:val="TableContents"/>
               <w:jc w:val="start"/>
               <w:rPr>
+                <w:b/>
+                <w:bCs/>
+              </w:rPr>
+            </w:pPr>
+            <w:r>
+              <w:rPr>
                 <w:rFonts w:ascii="Liberation Serif" w:hAnsi="Liberation Serif"/>
-                <w:color w:val="000000"/>
-                <w:szCs w:val="24"/>
-              </w:rPr>
-            </w:pPr>
-            <w:r>
-              <w:rPr>
-                <w:rFonts w:ascii="Liberation Serif" w:hAnsi="Liberation Serif"/>
+                <w:b/>
+                <w:bCs/>
                 <w:color w:val="000000"/>
                 <w:szCs w:val="24"/>
               </w:rPr>
@@ -1831,14 +2289,15 @@
               <w:pStyle w:val="TableContents"/>
               <w:jc w:val="start"/>
               <w:rPr>
+                <w:b/>
+                <w:bCs/>
+              </w:rPr>
+            </w:pPr>
+            <w:r>
+              <w:rPr>
                 <w:rFonts w:ascii="Liberation Serif" w:hAnsi="Liberation Serif"/>
-                <w:color w:val="000000"/>
-                <w:szCs w:val="24"/>
-              </w:rPr>
-            </w:pPr>
-            <w:r>
-              <w:rPr>
-                <w:rFonts w:ascii="Liberation Serif" w:hAnsi="Liberation Serif"/>
+                <w:b/>
+                <w:bCs/>
                 <w:color w:val="000000"/>
                 <w:szCs w:val="24"/>
               </w:rPr>
@@ -2156,6 +2615,82 @@
     </w:tbl>
     <w:p>
       <w:pPr>
+        <w:pStyle w:val="Heading3"/>
+        <w:numPr>
+          <w:ilvl w:val="0"/>
+          <w:numId w:val="0"/>
+        </w:numPr>
+        <w:ind w:hanging="0" w:start="0"/>
+        <w:rPr/>
+      </w:pPr>
+      <w:r>
+        <w:rPr/>
+      </w:r>
+    </w:p>
+    <w:p>
+      <w:pPr>
+        <w:pStyle w:val="Heading3"/>
+        <w:ind w:hanging="0" w:start="0"/>
+        <w:rPr/>
+      </w:pPr>
+      <w:r>
+        <w:rPr/>
+        <w:t>Formaty</w:t>
+      </w:r>
+    </w:p>
+    <w:p>
+      <w:pPr>
+        <w:pStyle w:val="Normal"/>
+        <w:rPr/>
+      </w:pPr>
+      <w:r>
+        <w:rPr/>
+        <w:t>JSON Schema wspiera również formatowanie danych. Przykładowe formaty obsługiwane przez schematy:</w:t>
+        <w:br/>
+        <w:t>- uuid – zgodnie z normą RFC 4122</w:t>
+      </w:r>
+    </w:p>
+    <w:p>
+      <w:pPr>
+        <w:pStyle w:val="Normal"/>
+        <w:rPr/>
+      </w:pPr>
+      <w:r>
+        <w:rPr/>
+        <w:t>- ipv4 – zgodnie z normą RFC 2673</w:t>
+      </w:r>
+    </w:p>
+    <w:p>
+      <w:pPr>
+        <w:pStyle w:val="Normal"/>
+        <w:rPr/>
+      </w:pPr>
+      <w:r>
+        <w:rPr/>
+        <w:t>- email – zgodnie z normą RFC 5321</w:t>
+      </w:r>
+    </w:p>
+    <w:p>
+      <w:pPr>
+        <w:pStyle w:val="Normal"/>
+        <w:rPr/>
+      </w:pPr>
+      <w:r>
+        <w:rPr/>
+      </w:r>
+    </w:p>
+    <w:p>
+      <w:pPr>
+        <w:pStyle w:val="Normal"/>
+        <w:rPr/>
+      </w:pPr>
+      <w:r>
+        <w:rPr/>
+        <w:t>JSON Schema pozwala również na zdefiniowanie własnego formatu za pomocą formatu ”regex”.</w:t>
+      </w:r>
+    </w:p>
+    <w:p>
+      <w:pPr>
         <w:pStyle w:val="Normal"/>
         <w:rPr/>
       </w:pPr>
@@ -2176,6 +2711,25 @@
         <w:t>CZĘŚĆ PRAKTYCZNA</w:t>
       </w:r>
       <w:bookmarkEnd w:id="7"/>
+    </w:p>
+    <w:p>
+      <w:pPr>
+        <w:pStyle w:val="Normal"/>
+        <w:rPr/>
+      </w:pPr>
+      <w:r>
+        <w:rPr/>
+        <w:t>W części praktycznej opisano wykorzystane technologie, funkcjonalności systemu oraz implementacje w języku Java.</w:t>
+      </w:r>
+    </w:p>
+    <w:p>
+      <w:pPr>
+        <w:pStyle w:val="Normal"/>
+        <w:rPr/>
+      </w:pPr>
+      <w:r>
+        <w:rPr/>
+      </w:r>
     </w:p>
     <w:p>
       <w:pPr>
@@ -2192,7 +2746,7 @@
         <w:tblStyle w:val="Tabela-Siatka"/>
         <w:tblW w:w="9634" w:type="dxa"/>
         <w:jc w:val="start"/>
-        <w:tblInd w:w="0" w:type="dxa"/>
+        <w:tblInd w:w="113" w:type="dxa"/>
         <w:tblLayout w:type="fixed"/>
         <w:tblCellMar>
           <w:top w:w="0" w:type="dxa"/>
@@ -2204,8 +2758,8 @@
       </w:tblPr>
       <w:tblGrid>
         <w:gridCol w:w="1838"/>
-        <w:gridCol w:w="3118"/>
-        <w:gridCol w:w="4678"/>
+        <w:gridCol w:w="3117"/>
+        <w:gridCol w:w="4679"/>
       </w:tblGrid>
       <w:tr>
         <w:trPr/>
@@ -2240,7 +2794,7 @@
         </w:tc>
         <w:tc>
           <w:tcPr>
-            <w:tcW w:w="3118" w:type="dxa"/>
+            <w:tcW w:w="3117" w:type="dxa"/>
             <w:tcBorders/>
           </w:tcPr>
           <w:p>
@@ -2268,7 +2822,7 @@
         </w:tc>
         <w:tc>
           <w:tcPr>
-            <w:tcW w:w="4678" w:type="dxa"/>
+            <w:tcW w:w="4679" w:type="dxa"/>
             <w:tcBorders/>
           </w:tcPr>
           <w:p>
@@ -2327,7 +2881,7 @@
         </w:tc>
         <w:tc>
           <w:tcPr>
-            <w:tcW w:w="3118" w:type="dxa"/>
+            <w:tcW w:w="3117" w:type="dxa"/>
             <w:tcBorders/>
           </w:tcPr>
           <w:p>
@@ -2355,7 +2909,7 @@
         </w:tc>
         <w:tc>
           <w:tcPr>
-            <w:tcW w:w="4678" w:type="dxa"/>
+            <w:tcW w:w="4679" w:type="dxa"/>
             <w:tcBorders/>
           </w:tcPr>
           <w:p>
@@ -2377,25 +2931,7 @@
                 <w:szCs w:val="22"/>
                 <w:lang w:val="pl-PL" w:bidi="ar-SA"/>
               </w:rPr>
-              <w:t>Gł</w:t>
-            </w:r>
-            <w:r>
-              <w:rPr>
-                <w:rFonts w:cs="Times New Roman"/>
-                <w:kern w:val="0"/>
-                <w:szCs w:val="22"/>
-                <w:lang w:val="pl-PL" w:bidi="ar-SA"/>
-              </w:rPr>
-              <w:t>ó</w:t>
-            </w:r>
-            <w:r>
-              <w:rPr>
-                <w:rFonts w:cs="Times New Roman"/>
-                <w:kern w:val="0"/>
-                <w:szCs w:val="22"/>
-                <w:lang w:val="pl-PL" w:bidi="ar-SA"/>
-              </w:rPr>
-              <w:t>wny framework</w:t>
+              <w:t>Główny framework</w:t>
             </w:r>
           </w:p>
         </w:tc>
@@ -2432,7 +2968,7 @@
         </w:tc>
         <w:tc>
           <w:tcPr>
-            <w:tcW w:w="3118" w:type="dxa"/>
+            <w:tcW w:w="3117" w:type="dxa"/>
             <w:tcBorders/>
           </w:tcPr>
           <w:p>
@@ -2460,7 +2996,7 @@
         </w:tc>
         <w:tc>
           <w:tcPr>
-            <w:tcW w:w="4678" w:type="dxa"/>
+            <w:tcW w:w="4679" w:type="dxa"/>
             <w:tcBorders/>
           </w:tcPr>
           <w:p>
@@ -2519,7 +3055,7 @@
         </w:tc>
         <w:tc>
           <w:tcPr>
-            <w:tcW w:w="3118" w:type="dxa"/>
+            <w:tcW w:w="3117" w:type="dxa"/>
             <w:tcBorders/>
           </w:tcPr>
           <w:p>
@@ -2547,7 +3083,7 @@
         </w:tc>
         <w:tc>
           <w:tcPr>
-            <w:tcW w:w="4678" w:type="dxa"/>
+            <w:tcW w:w="4679" w:type="dxa"/>
             <w:tcBorders/>
           </w:tcPr>
           <w:p>
@@ -2606,7 +3142,7 @@
         </w:tc>
         <w:tc>
           <w:tcPr>
-            <w:tcW w:w="3118" w:type="dxa"/>
+            <w:tcW w:w="3117" w:type="dxa"/>
             <w:tcBorders/>
           </w:tcPr>
           <w:p>
@@ -2634,7 +3170,7 @@
         </w:tc>
         <w:tc>
           <w:tcPr>
-            <w:tcW w:w="4678" w:type="dxa"/>
+            <w:tcW w:w="4679" w:type="dxa"/>
             <w:tcBorders/>
           </w:tcPr>
           <w:p>
@@ -2656,25 +3192,7 @@
                 <w:szCs w:val="22"/>
                 <w:lang w:val="pl-PL" w:bidi="ar-SA"/>
               </w:rPr>
-              <w:t>Narzędzie do automatycznego generowania getterów, set</w:t>
-            </w:r>
-            <w:r>
-              <w:rPr>
-                <w:rFonts w:cs="Times New Roman"/>
-                <w:kern w:val="0"/>
-                <w:szCs w:val="22"/>
-                <w:lang w:val="pl-PL" w:bidi="ar-SA"/>
-              </w:rPr>
-              <w:t>t</w:t>
-            </w:r>
-            <w:r>
-              <w:rPr>
-                <w:rFonts w:cs="Times New Roman"/>
-                <w:kern w:val="0"/>
-                <w:szCs w:val="22"/>
-                <w:lang w:val="pl-PL" w:bidi="ar-SA"/>
-              </w:rPr>
-              <w:t>erów i konstruktorów</w:t>
+              <w:t>Narzędzie do automatycznego generowania getterów, setterów i konstruktorów</w:t>
             </w:r>
           </w:p>
         </w:tc>
@@ -2711,7 +3229,7 @@
         </w:tc>
         <w:tc>
           <w:tcPr>
-            <w:tcW w:w="3118" w:type="dxa"/>
+            <w:tcW w:w="3117" w:type="dxa"/>
             <w:tcBorders/>
           </w:tcPr>
           <w:p>
@@ -2739,7 +3257,7 @@
         </w:tc>
         <w:tc>
           <w:tcPr>
-            <w:tcW w:w="4678" w:type="dxa"/>
+            <w:tcW w:w="4679" w:type="dxa"/>
             <w:tcBorders/>
           </w:tcPr>
           <w:p>
@@ -2799,7 +3317,7 @@
         </w:tc>
         <w:tc>
           <w:tcPr>
-            <w:tcW w:w="3118" w:type="dxa"/>
+            <w:tcW w:w="3117" w:type="dxa"/>
             <w:tcBorders/>
           </w:tcPr>
           <w:p>
@@ -2827,7 +3345,7 @@
         </w:tc>
         <w:tc>
           <w:tcPr>
-            <w:tcW w:w="4678" w:type="dxa"/>
+            <w:tcW w:w="4679" w:type="dxa"/>
             <w:tcBorders/>
           </w:tcPr>
           <w:p>
@@ -2886,7 +3404,7 @@
         </w:tc>
         <w:tc>
           <w:tcPr>
-            <w:tcW w:w="3118" w:type="dxa"/>
+            <w:tcW w:w="3117" w:type="dxa"/>
             <w:tcBorders/>
           </w:tcPr>
           <w:p>
@@ -2914,7 +3432,7 @@
         </w:tc>
         <w:tc>
           <w:tcPr>
-            <w:tcW w:w="4678" w:type="dxa"/>
+            <w:tcW w:w="4679" w:type="dxa"/>
             <w:tcBorders/>
           </w:tcPr>
           <w:p>
@@ -3003,11 +3521,7 @@
       </w:pPr>
       <w:r>
         <w:rPr/>
-        <w:t xml:space="preserve">- </w:t>
-      </w:r>
-      <w:r>
-        <w:rPr/>
-        <w:t>Generowanie schematów na podstawie dokumentów JSON</w:t>
+        <w:t>- Generowanie schematów na podstawie dokumentów JSON</w:t>
       </w:r>
     </w:p>
     <w:p>
@@ -3017,11 +3531,7 @@
       </w:pPr>
       <w:r>
         <w:rPr/>
-        <w:t xml:space="preserve">- </w:t>
-      </w:r>
-      <w:r>
-        <w:rPr/>
-        <w:t>Zapisywanie i pobieranie schematów z bazy danych</w:t>
+        <w:t>- Zapisywanie i pobieranie schematów z bazy danych</w:t>
       </w:r>
     </w:p>
     <w:p>
@@ -3031,11 +3541,7 @@
       </w:pPr>
       <w:r>
         <w:rPr/>
-        <w:t xml:space="preserve">- </w:t>
-      </w:r>
-      <w:r>
-        <w:rPr/>
-        <w:t>Weryfikacja poprawności dokumentu JSON</w:t>
+        <w:t>- Weryfikacja poprawności dokumentu JSON</w:t>
       </w:r>
     </w:p>
     <w:p>
@@ -3045,21 +3551,1002 @@
       </w:pPr>
       <w:r>
         <w:rPr/>
-        <w:t xml:space="preserve">- </w:t>
-      </w:r>
-      <w:r>
-        <w:rPr/>
-        <w:t>Weryfikacja poprawności dokumentu JSON z wybranym schematem</w:t>
+        <w:t>- Weryfikacja poprawności dokumentu JSON z wybranym schematem</w:t>
       </w:r>
     </w:p>
     <w:p>
       <w:pPr>
         <w:pStyle w:val="Normal"/>
-        <w:numPr>
-          <w:ilvl w:val="0"/>
-          <w:numId w:val="0"/>
-        </w:numPr>
+        <w:rPr/>
+      </w:pPr>
+      <w:r>
+        <w:rPr/>
+      </w:r>
+    </w:p>
+    <w:p>
+      <w:pPr>
+        <w:pStyle w:val="Heading2"/>
         <w:ind w:hanging="0" w:start="0"/>
+        <w:rPr/>
+      </w:pPr>
+      <w:r>
+        <w:rPr/>
+        <w:t>Implementacja</w:t>
+      </w:r>
+    </w:p>
+    <w:p>
+      <w:pPr>
+        <w:pStyle w:val="Heading3"/>
+        <w:ind w:hanging="0" w:start="0"/>
+        <w:rPr/>
+      </w:pPr>
+      <w:r>
+        <w:rPr/>
+        <w:t>Encje</w:t>
+      </w:r>
+    </w:p>
+    <w:p>
+      <w:pPr>
+        <w:pStyle w:val="Normal"/>
+        <w:rPr/>
+      </w:pPr>
+      <w:r>
+        <w:rPr/>
+        <w:t>W systemie wykorzystano jedną encję – JsonSchema.</w:t>
+      </w:r>
+    </w:p>
+    <w:p>
+      <w:pPr>
+        <w:pStyle w:val="Normal"/>
+        <w:rPr/>
+      </w:pPr>
+      <w:r>
+        <w:rPr/>
+      </w:r>
+    </w:p>
+    <w:p>
+      <w:pPr>
+        <w:pStyle w:val="Listing"/>
+        <w:keepNext w:val="true"/>
+        <w:jc w:val="center"/>
+        <w:rPr/>
+      </w:pPr>
+      <w:r>
+        <w:rPr/>
+        <w:t xml:space="preserve">Listing </w:t>
+      </w:r>
+      <w:r>
+        <w:rPr/>
+        <w:fldChar w:fldCharType="begin"/>
+      </w:r>
+      <w:r>
+        <w:rPr/>
+        <w:instrText xml:space="preserve"> SEQ Listing \* ARABIC </w:instrText>
+      </w:r>
+      <w:r>
+        <w:rPr/>
+        <w:fldChar w:fldCharType="separate"/>
+      </w:r>
+      <w:r>
+        <w:rPr/>
+        <w:t>3</w:t>
+      </w:r>
+      <w:r>
+        <w:rPr/>
+        <w:fldChar w:fldCharType="end"/>
+      </w:r>
+      <w:r>
+        <w:rPr/>
+        <w:t>: Encja JsonSchema</w:t>
+      </w:r>
+    </w:p>
+    <w:tbl>
+      <w:tblPr>
+        <w:tblW w:w="5000" w:type="pct"/>
+        <w:jc w:val="start"/>
+        <w:tblInd w:w="55" w:type="dxa"/>
+        <w:tblLayout w:type="fixed"/>
+        <w:tblCellMar>
+          <w:top w:w="55" w:type="dxa"/>
+          <w:start w:w="55" w:type="dxa"/>
+          <w:bottom w:w="55" w:type="dxa"/>
+          <w:end w:w="55" w:type="dxa"/>
+        </w:tblCellMar>
+      </w:tblPr>
+      <w:tblGrid>
+        <w:gridCol w:w="9638"/>
+      </w:tblGrid>
+      <w:tr>
+        <w:trPr/>
+        <w:tc>
+          <w:tcPr>
+            <w:tcW w:w="9638" w:type="dxa"/>
+            <w:tcBorders>
+              <w:top w:val="single" w:sz="4" w:space="0" w:color="000000"/>
+              <w:start w:val="single" w:sz="4" w:space="0" w:color="000000"/>
+              <w:bottom w:val="single" w:sz="4" w:space="0" w:color="000000"/>
+              <w:end w:val="single" w:sz="4" w:space="0" w:color="000000"/>
+            </w:tcBorders>
+          </w:tcPr>
+          <w:p>
+            <w:pPr>
+              <w:pStyle w:val="Normal"/>
+              <w:pBdr/>
+              <w:shd w:fill="FFFFFF" w:val="clear"/>
+              <w:jc w:val="start"/>
+              <w:rPr>
+                <w:rFonts w:ascii="Consolas" w:hAnsi="Consolas"/>
+                <w:sz w:val="20"/>
+                <w:szCs w:val="20"/>
+              </w:rPr>
+            </w:pPr>
+            <w:r>
+              <w:rPr>
+                <w:rFonts w:ascii="Consolas" w:hAnsi="Consolas"/>
+                <w:b w:val="false"/>
+                <w:i w:val="false"/>
+                <w:color w:val="9E880D"/>
+                <w:sz w:val="20"/>
+                <w:szCs w:val="20"/>
+              </w:rPr>
+              <w:t>@Document</w:t>
+            </w:r>
+            <w:r>
+              <w:rPr>
+                <w:rFonts w:ascii="Consolas" w:hAnsi="Consolas"/>
+                <w:b w:val="false"/>
+                <w:i w:val="false"/>
+                <w:color w:val="080808"/>
+                <w:sz w:val="20"/>
+                <w:szCs w:val="20"/>
+              </w:rPr>
+              <w:t xml:space="preserve">(collection = </w:t>
+            </w:r>
+            <w:r>
+              <w:rPr>
+                <w:rFonts w:ascii="Consolas" w:hAnsi="Consolas"/>
+                <w:b w:val="false"/>
+                <w:i w:val="false"/>
+                <w:color w:val="067D17"/>
+                <w:sz w:val="20"/>
+                <w:szCs w:val="20"/>
+              </w:rPr>
+              <w:t>"Schemas"</w:t>
+            </w:r>
+            <w:r>
+              <w:rPr>
+                <w:rFonts w:ascii="Consolas" w:hAnsi="Consolas"/>
+                <w:b w:val="false"/>
+                <w:i w:val="false"/>
+                <w:color w:val="080808"/>
+                <w:sz w:val="20"/>
+                <w:szCs w:val="20"/>
+              </w:rPr>
+              <w:t>)</w:t>
+              <w:br/>
+            </w:r>
+            <w:r>
+              <w:rPr>
+                <w:rFonts w:ascii="Consolas" w:hAnsi="Consolas"/>
+                <w:b w:val="false"/>
+                <w:i w:val="false"/>
+                <w:color w:val="9E880D"/>
+                <w:sz w:val="20"/>
+                <w:szCs w:val="20"/>
+              </w:rPr>
+              <w:t>@Setter</w:t>
+              <w:br/>
+              <w:t>@Getter</w:t>
+              <w:br/>
+              <w:t>@NoArgsConstructor</w:t>
+              <w:br/>
+            </w:r>
+            <w:r>
+              <w:rPr>
+                <w:rFonts w:ascii="Consolas" w:hAnsi="Consolas"/>
+                <w:b w:val="false"/>
+                <w:i w:val="false"/>
+                <w:color w:val="0033B3"/>
+                <w:sz w:val="20"/>
+                <w:szCs w:val="20"/>
+              </w:rPr>
+              <w:t xml:space="preserve">public class </w:t>
+            </w:r>
+            <w:r>
+              <w:rPr>
+                <w:rFonts w:ascii="Consolas" w:hAnsi="Consolas"/>
+                <w:b w:val="false"/>
+                <w:i w:val="false"/>
+                <w:color w:val="000000"/>
+                <w:sz w:val="20"/>
+                <w:szCs w:val="20"/>
+              </w:rPr>
+              <w:t xml:space="preserve">JsonSchema </w:t>
+            </w:r>
+            <w:r>
+              <w:rPr>
+                <w:rFonts w:ascii="Consolas" w:hAnsi="Consolas"/>
+                <w:b w:val="false"/>
+                <w:i w:val="false"/>
+                <w:color w:val="080808"/>
+                <w:sz w:val="20"/>
+                <w:szCs w:val="20"/>
+              </w:rPr>
+              <w:t>{</w:t>
+              <w:br/>
+              <w:t xml:space="preserve">    </w:t>
+            </w:r>
+            <w:r>
+              <w:rPr>
+                <w:rFonts w:ascii="Consolas" w:hAnsi="Consolas"/>
+                <w:b w:val="false"/>
+                <w:i w:val="false"/>
+                <w:color w:val="9E880D"/>
+                <w:sz w:val="20"/>
+                <w:szCs w:val="20"/>
+              </w:rPr>
+              <w:t>@Id</w:t>
+              <w:br/>
+              <w:t xml:space="preserve">    </w:t>
+            </w:r>
+            <w:r>
+              <w:rPr>
+                <w:rFonts w:ascii="Consolas" w:hAnsi="Consolas"/>
+                <w:b w:val="false"/>
+                <w:i w:val="false"/>
+                <w:color w:val="0033B3"/>
+                <w:sz w:val="20"/>
+                <w:szCs w:val="20"/>
+              </w:rPr>
+              <w:t xml:space="preserve">private </w:t>
+            </w:r>
+            <w:r>
+              <w:rPr>
+                <w:rFonts w:ascii="Consolas" w:hAnsi="Consolas"/>
+                <w:b w:val="false"/>
+                <w:i w:val="false"/>
+                <w:color w:val="000000"/>
+                <w:sz w:val="20"/>
+                <w:szCs w:val="20"/>
+              </w:rPr>
+              <w:t xml:space="preserve">String </w:t>
+            </w:r>
+            <w:r>
+              <w:rPr>
+                <w:rFonts w:ascii="Consolas" w:hAnsi="Consolas"/>
+                <w:b w:val="false"/>
+                <w:i w:val="false"/>
+                <w:color w:val="871094"/>
+                <w:sz w:val="20"/>
+                <w:szCs w:val="20"/>
+              </w:rPr>
+              <w:t>id</w:t>
+            </w:r>
+            <w:r>
+              <w:rPr>
+                <w:rFonts w:ascii="Consolas" w:hAnsi="Consolas"/>
+                <w:b w:val="false"/>
+                <w:i w:val="false"/>
+                <w:color w:val="080808"/>
+                <w:sz w:val="20"/>
+                <w:szCs w:val="20"/>
+              </w:rPr>
+              <w:t>;</w:t>
+              <w:br/>
+              <w:t xml:space="preserve">    </w:t>
+            </w:r>
+            <w:r>
+              <w:rPr>
+                <w:rFonts w:ascii="Consolas" w:hAnsi="Consolas"/>
+                <w:b w:val="false"/>
+                <w:i w:val="false"/>
+                <w:color w:val="0033B3"/>
+                <w:sz w:val="20"/>
+                <w:szCs w:val="20"/>
+              </w:rPr>
+              <w:t xml:space="preserve">private </w:t>
+            </w:r>
+            <w:r>
+              <w:rPr>
+                <w:rFonts w:ascii="Consolas" w:hAnsi="Consolas"/>
+                <w:b w:val="false"/>
+                <w:i w:val="false"/>
+                <w:color w:val="000000"/>
+                <w:sz w:val="20"/>
+                <w:szCs w:val="20"/>
+              </w:rPr>
+              <w:t xml:space="preserve">String </w:t>
+            </w:r>
+            <w:r>
+              <w:rPr>
+                <w:rFonts w:ascii="Consolas" w:hAnsi="Consolas"/>
+                <w:b w:val="false"/>
+                <w:i w:val="false"/>
+                <w:color w:val="871094"/>
+                <w:sz w:val="20"/>
+                <w:szCs w:val="20"/>
+              </w:rPr>
+              <w:t>name</w:t>
+            </w:r>
+            <w:r>
+              <w:rPr>
+                <w:rFonts w:ascii="Consolas" w:hAnsi="Consolas"/>
+                <w:b w:val="false"/>
+                <w:i w:val="false"/>
+                <w:color w:val="080808"/>
+                <w:sz w:val="20"/>
+                <w:szCs w:val="20"/>
+              </w:rPr>
+              <w:t>;</w:t>
+              <w:br/>
+              <w:t xml:space="preserve">    </w:t>
+            </w:r>
+            <w:r>
+              <w:rPr>
+                <w:rFonts w:ascii="Consolas" w:hAnsi="Consolas"/>
+                <w:b w:val="false"/>
+                <w:i w:val="false"/>
+                <w:color w:val="0033B3"/>
+                <w:sz w:val="20"/>
+                <w:szCs w:val="20"/>
+              </w:rPr>
+              <w:t xml:space="preserve">private </w:t>
+            </w:r>
+            <w:r>
+              <w:rPr>
+                <w:rFonts w:ascii="Consolas" w:hAnsi="Consolas"/>
+                <w:b w:val="false"/>
+                <w:i w:val="false"/>
+                <w:color w:val="000000"/>
+                <w:sz w:val="20"/>
+                <w:szCs w:val="20"/>
+              </w:rPr>
+              <w:t xml:space="preserve">String </w:t>
+            </w:r>
+            <w:r>
+              <w:rPr>
+                <w:rFonts w:ascii="Consolas" w:hAnsi="Consolas"/>
+                <w:b w:val="false"/>
+                <w:i w:val="false"/>
+                <w:color w:val="871094"/>
+                <w:sz w:val="20"/>
+                <w:szCs w:val="20"/>
+              </w:rPr>
+              <w:t>schemaData</w:t>
+            </w:r>
+            <w:r>
+              <w:rPr>
+                <w:rFonts w:ascii="Consolas" w:hAnsi="Consolas"/>
+                <w:b w:val="false"/>
+                <w:i w:val="false"/>
+                <w:color w:val="080808"/>
+                <w:sz w:val="20"/>
+                <w:szCs w:val="20"/>
+              </w:rPr>
+              <w:t>;</w:t>
+              <w:br/>
+              <w:br/>
+              <w:t xml:space="preserve">    </w:t>
+            </w:r>
+            <w:r>
+              <w:rPr>
+                <w:rFonts w:ascii="Consolas" w:hAnsi="Consolas"/>
+                <w:b w:val="false"/>
+                <w:i w:val="false"/>
+                <w:color w:val="0033B3"/>
+                <w:sz w:val="20"/>
+                <w:szCs w:val="20"/>
+              </w:rPr>
+              <w:t xml:space="preserve">public </w:t>
+            </w:r>
+            <w:r>
+              <w:rPr>
+                <w:rFonts w:ascii="Consolas" w:hAnsi="Consolas"/>
+                <w:b w:val="false"/>
+                <w:i w:val="false"/>
+                <w:color w:val="00627A"/>
+                <w:sz w:val="20"/>
+                <w:szCs w:val="20"/>
+              </w:rPr>
+              <w:t>JsonSchema</w:t>
+            </w:r>
+            <w:r>
+              <w:rPr>
+                <w:rFonts w:ascii="Consolas" w:hAnsi="Consolas"/>
+                <w:b w:val="false"/>
+                <w:i w:val="false"/>
+                <w:color w:val="080808"/>
+                <w:sz w:val="20"/>
+                <w:szCs w:val="20"/>
+              </w:rPr>
+              <w:t>(</w:t>
+            </w:r>
+            <w:r>
+              <w:rPr>
+                <w:rFonts w:ascii="Consolas" w:hAnsi="Consolas"/>
+                <w:b w:val="false"/>
+                <w:i w:val="false"/>
+                <w:color w:val="000000"/>
+                <w:sz w:val="20"/>
+                <w:szCs w:val="20"/>
+              </w:rPr>
+              <w:t>JsonSchemaRequest request</w:t>
+            </w:r>
+            <w:r>
+              <w:rPr>
+                <w:rFonts w:ascii="Consolas" w:hAnsi="Consolas"/>
+                <w:b w:val="false"/>
+                <w:i w:val="false"/>
+                <w:color w:val="080808"/>
+                <w:sz w:val="20"/>
+                <w:szCs w:val="20"/>
+              </w:rPr>
+              <w:t>) {</w:t>
+              <w:br/>
+              <w:t xml:space="preserve">        </w:t>
+            </w:r>
+            <w:r>
+              <w:rPr>
+                <w:rFonts w:ascii="Consolas" w:hAnsi="Consolas"/>
+                <w:b w:val="false"/>
+                <w:i w:val="false"/>
+                <w:color w:val="0033B3"/>
+                <w:sz w:val="20"/>
+                <w:szCs w:val="20"/>
+              </w:rPr>
+              <w:t>this</w:t>
+            </w:r>
+            <w:r>
+              <w:rPr>
+                <w:rFonts w:ascii="Consolas" w:hAnsi="Consolas"/>
+                <w:b w:val="false"/>
+                <w:i w:val="false"/>
+                <w:color w:val="080808"/>
+                <w:sz w:val="20"/>
+                <w:szCs w:val="20"/>
+              </w:rPr>
+              <w:t>.</w:t>
+            </w:r>
+            <w:r>
+              <w:rPr>
+                <w:rFonts w:ascii="Consolas" w:hAnsi="Consolas"/>
+                <w:b w:val="false"/>
+                <w:i w:val="false"/>
+                <w:color w:val="871094"/>
+                <w:sz w:val="20"/>
+                <w:szCs w:val="20"/>
+              </w:rPr>
+              <w:t xml:space="preserve">name </w:t>
+            </w:r>
+            <w:r>
+              <w:rPr>
+                <w:rFonts w:ascii="Consolas" w:hAnsi="Consolas"/>
+                <w:b w:val="false"/>
+                <w:i w:val="false"/>
+                <w:color w:val="080808"/>
+                <w:sz w:val="20"/>
+                <w:szCs w:val="20"/>
+              </w:rPr>
+              <w:t xml:space="preserve">= </w:t>
+            </w:r>
+            <w:r>
+              <w:rPr>
+                <w:rFonts w:ascii="Consolas" w:hAnsi="Consolas"/>
+                <w:b w:val="false"/>
+                <w:i w:val="false"/>
+                <w:color w:val="000000"/>
+                <w:sz w:val="20"/>
+                <w:szCs w:val="20"/>
+              </w:rPr>
+              <w:t>request</w:t>
+            </w:r>
+            <w:r>
+              <w:rPr>
+                <w:rFonts w:ascii="Consolas" w:hAnsi="Consolas"/>
+                <w:b w:val="false"/>
+                <w:i w:val="false"/>
+                <w:color w:val="080808"/>
+                <w:sz w:val="20"/>
+                <w:szCs w:val="20"/>
+              </w:rPr>
+              <w:t>.getName();</w:t>
+              <w:br/>
+              <w:t xml:space="preserve">        </w:t>
+            </w:r>
+            <w:r>
+              <w:rPr>
+                <w:rFonts w:ascii="Consolas" w:hAnsi="Consolas"/>
+                <w:b w:val="false"/>
+                <w:i w:val="false"/>
+                <w:color w:val="0033B3"/>
+                <w:sz w:val="20"/>
+                <w:szCs w:val="20"/>
+              </w:rPr>
+              <w:t>this</w:t>
+            </w:r>
+            <w:r>
+              <w:rPr>
+                <w:rFonts w:ascii="Consolas" w:hAnsi="Consolas"/>
+                <w:b w:val="false"/>
+                <w:i w:val="false"/>
+                <w:color w:val="080808"/>
+                <w:sz w:val="20"/>
+                <w:szCs w:val="20"/>
+              </w:rPr>
+              <w:t>.</w:t>
+            </w:r>
+            <w:r>
+              <w:rPr>
+                <w:rFonts w:ascii="Consolas" w:hAnsi="Consolas"/>
+                <w:b w:val="false"/>
+                <w:i w:val="false"/>
+                <w:color w:val="871094"/>
+                <w:sz w:val="20"/>
+                <w:szCs w:val="20"/>
+              </w:rPr>
+              <w:t xml:space="preserve">schemaData </w:t>
+            </w:r>
+            <w:r>
+              <w:rPr>
+                <w:rFonts w:ascii="Consolas" w:hAnsi="Consolas"/>
+                <w:b w:val="false"/>
+                <w:i w:val="false"/>
+                <w:color w:val="080808"/>
+                <w:sz w:val="20"/>
+                <w:szCs w:val="20"/>
+              </w:rPr>
+              <w:t xml:space="preserve">= </w:t>
+            </w:r>
+            <w:r>
+              <w:rPr>
+                <w:rFonts w:ascii="Consolas" w:hAnsi="Consolas"/>
+                <w:b w:val="false"/>
+                <w:i w:val="false"/>
+                <w:color w:val="000000"/>
+                <w:sz w:val="20"/>
+                <w:szCs w:val="20"/>
+              </w:rPr>
+              <w:t>request</w:t>
+            </w:r>
+            <w:r>
+              <w:rPr>
+                <w:rFonts w:ascii="Consolas" w:hAnsi="Consolas"/>
+                <w:b w:val="false"/>
+                <w:i w:val="false"/>
+                <w:color w:val="080808"/>
+                <w:sz w:val="20"/>
+                <w:szCs w:val="20"/>
+              </w:rPr>
+              <w:t>.getSchemaData();</w:t>
+              <w:br/>
+              <w:t xml:space="preserve">    }</w:t>
+              <w:br/>
+              <w:br/>
+              <w:t xml:space="preserve">    </w:t>
+            </w:r>
+            <w:r>
+              <w:rPr>
+                <w:rFonts w:ascii="Consolas" w:hAnsi="Consolas"/>
+                <w:b w:val="false"/>
+                <w:i w:val="false"/>
+                <w:color w:val="0033B3"/>
+                <w:sz w:val="20"/>
+                <w:szCs w:val="20"/>
+              </w:rPr>
+              <w:t xml:space="preserve">public </w:t>
+            </w:r>
+            <w:r>
+              <w:rPr>
+                <w:rFonts w:ascii="Consolas" w:hAnsi="Consolas"/>
+                <w:b w:val="false"/>
+                <w:i w:val="false"/>
+                <w:color w:val="00627A"/>
+                <w:sz w:val="20"/>
+                <w:szCs w:val="20"/>
+              </w:rPr>
+              <w:t>JsonSchema</w:t>
+            </w:r>
+            <w:r>
+              <w:rPr>
+                <w:rFonts w:ascii="Consolas" w:hAnsi="Consolas"/>
+                <w:b w:val="false"/>
+                <w:i w:val="false"/>
+                <w:color w:val="080808"/>
+                <w:sz w:val="20"/>
+                <w:szCs w:val="20"/>
+              </w:rPr>
+              <w:t>(</w:t>
+            </w:r>
+            <w:r>
+              <w:rPr>
+                <w:rFonts w:ascii="Consolas" w:hAnsi="Consolas"/>
+                <w:b w:val="false"/>
+                <w:i w:val="false"/>
+                <w:color w:val="000000"/>
+                <w:sz w:val="20"/>
+                <w:szCs w:val="20"/>
+              </w:rPr>
+              <w:t>String schemaName</w:t>
+            </w:r>
+            <w:r>
+              <w:rPr>
+                <w:rFonts w:ascii="Consolas" w:hAnsi="Consolas"/>
+                <w:b w:val="false"/>
+                <w:i w:val="false"/>
+                <w:color w:val="080808"/>
+                <w:sz w:val="20"/>
+                <w:szCs w:val="20"/>
+              </w:rPr>
+              <w:t xml:space="preserve">, </w:t>
+            </w:r>
+            <w:r>
+              <w:rPr>
+                <w:rFonts w:ascii="Consolas" w:hAnsi="Consolas"/>
+                <w:b w:val="false"/>
+                <w:i w:val="false"/>
+                <w:color w:val="000000"/>
+                <w:sz w:val="20"/>
+                <w:szCs w:val="20"/>
+              </w:rPr>
+              <w:t>String schemaData</w:t>
+            </w:r>
+            <w:r>
+              <w:rPr>
+                <w:rFonts w:ascii="Consolas" w:hAnsi="Consolas"/>
+                <w:b w:val="false"/>
+                <w:i w:val="false"/>
+                <w:color w:val="080808"/>
+                <w:sz w:val="20"/>
+                <w:szCs w:val="20"/>
+              </w:rPr>
+              <w:t>) {</w:t>
+              <w:br/>
+              <w:t xml:space="preserve">        </w:t>
+            </w:r>
+            <w:r>
+              <w:rPr>
+                <w:rFonts w:ascii="Consolas" w:hAnsi="Consolas"/>
+                <w:b w:val="false"/>
+                <w:i w:val="false"/>
+                <w:color w:val="0033B3"/>
+                <w:sz w:val="20"/>
+                <w:szCs w:val="20"/>
+              </w:rPr>
+              <w:t>this</w:t>
+            </w:r>
+            <w:r>
+              <w:rPr>
+                <w:rFonts w:ascii="Consolas" w:hAnsi="Consolas"/>
+                <w:b w:val="false"/>
+                <w:i w:val="false"/>
+                <w:color w:val="080808"/>
+                <w:sz w:val="20"/>
+                <w:szCs w:val="20"/>
+              </w:rPr>
+              <w:t>.</w:t>
+            </w:r>
+            <w:r>
+              <w:rPr>
+                <w:rFonts w:ascii="Consolas" w:hAnsi="Consolas"/>
+                <w:b w:val="false"/>
+                <w:i w:val="false"/>
+                <w:color w:val="871094"/>
+                <w:sz w:val="20"/>
+                <w:szCs w:val="20"/>
+              </w:rPr>
+              <w:t xml:space="preserve">name </w:t>
+            </w:r>
+            <w:r>
+              <w:rPr>
+                <w:rFonts w:ascii="Consolas" w:hAnsi="Consolas"/>
+                <w:b w:val="false"/>
+                <w:i w:val="false"/>
+                <w:color w:val="080808"/>
+                <w:sz w:val="20"/>
+                <w:szCs w:val="20"/>
+              </w:rPr>
+              <w:t xml:space="preserve">= </w:t>
+            </w:r>
+            <w:r>
+              <w:rPr>
+                <w:rFonts w:ascii="Consolas" w:hAnsi="Consolas"/>
+                <w:b w:val="false"/>
+                <w:i w:val="false"/>
+                <w:color w:val="000000"/>
+                <w:sz w:val="20"/>
+                <w:szCs w:val="20"/>
+              </w:rPr>
+              <w:t>schemaName</w:t>
+            </w:r>
+            <w:r>
+              <w:rPr>
+                <w:rFonts w:ascii="Consolas" w:hAnsi="Consolas"/>
+                <w:b w:val="false"/>
+                <w:i w:val="false"/>
+                <w:color w:val="080808"/>
+                <w:sz w:val="20"/>
+                <w:szCs w:val="20"/>
+              </w:rPr>
+              <w:t>;</w:t>
+              <w:br/>
+              <w:t xml:space="preserve">        </w:t>
+            </w:r>
+            <w:r>
+              <w:rPr>
+                <w:rFonts w:ascii="Consolas" w:hAnsi="Consolas"/>
+                <w:b w:val="false"/>
+                <w:i w:val="false"/>
+                <w:color w:val="0033B3"/>
+                <w:sz w:val="20"/>
+                <w:szCs w:val="20"/>
+              </w:rPr>
+              <w:t>this</w:t>
+            </w:r>
+            <w:r>
+              <w:rPr>
+                <w:rFonts w:ascii="Consolas" w:hAnsi="Consolas"/>
+                <w:b w:val="false"/>
+                <w:i w:val="false"/>
+                <w:color w:val="080808"/>
+                <w:sz w:val="20"/>
+                <w:szCs w:val="20"/>
+              </w:rPr>
+              <w:t>.</w:t>
+            </w:r>
+            <w:r>
+              <w:rPr>
+                <w:rFonts w:ascii="Consolas" w:hAnsi="Consolas"/>
+                <w:b w:val="false"/>
+                <w:i w:val="false"/>
+                <w:color w:val="871094"/>
+                <w:sz w:val="20"/>
+                <w:szCs w:val="20"/>
+              </w:rPr>
+              <w:t xml:space="preserve">schemaData </w:t>
+            </w:r>
+            <w:r>
+              <w:rPr>
+                <w:rFonts w:ascii="Consolas" w:hAnsi="Consolas"/>
+                <w:b w:val="false"/>
+                <w:i w:val="false"/>
+                <w:color w:val="080808"/>
+                <w:sz w:val="20"/>
+                <w:szCs w:val="20"/>
+              </w:rPr>
+              <w:t xml:space="preserve">= </w:t>
+            </w:r>
+            <w:r>
+              <w:rPr>
+                <w:rFonts w:ascii="Consolas" w:hAnsi="Consolas"/>
+                <w:b w:val="false"/>
+                <w:i w:val="false"/>
+                <w:color w:val="000000"/>
+                <w:sz w:val="20"/>
+                <w:szCs w:val="20"/>
+              </w:rPr>
+              <w:t>schemaData</w:t>
+            </w:r>
+            <w:r>
+              <w:rPr>
+                <w:rFonts w:ascii="Consolas" w:hAnsi="Consolas"/>
+                <w:b w:val="false"/>
+                <w:i w:val="false"/>
+                <w:color w:val="080808"/>
+                <w:sz w:val="20"/>
+                <w:szCs w:val="20"/>
+              </w:rPr>
+              <w:t>;</w:t>
+              <w:br/>
+              <w:t xml:space="preserve">    }</w:t>
+              <w:br/>
+              <w:t>}</w:t>
+            </w:r>
+          </w:p>
+        </w:tc>
+      </w:tr>
+    </w:tbl>
+    <w:p>
+      <w:pPr>
+        <w:pStyle w:val="Normal"/>
+        <w:rPr/>
+      </w:pPr>
+      <w:r>
+        <w:rPr/>
+      </w:r>
+    </w:p>
+    <w:p>
+      <w:pPr>
+        <w:pStyle w:val="Heading3"/>
+        <w:ind w:hanging="0" w:start="0"/>
+        <w:rPr/>
+      </w:pPr>
+      <w:r>
+        <w:rPr/>
+        <w:t>Repozytori</w:t>
+      </w:r>
+      <w:r>
+        <w:rPr/>
+        <w:t>a</w:t>
+      </w:r>
+    </w:p>
+    <w:p>
+      <w:pPr>
+        <w:pStyle w:val="Normal"/>
+        <w:rPr/>
+      </w:pPr>
+      <w:r>
+        <w:rPr/>
+      </w:r>
+    </w:p>
+    <w:tbl>
+      <w:tblPr>
+        <w:tblW w:w="5000" w:type="pct"/>
+        <w:jc w:val="start"/>
+        <w:tblInd w:w="55" w:type="dxa"/>
+        <w:tblLayout w:type="fixed"/>
+        <w:tblCellMar>
+          <w:top w:w="55" w:type="dxa"/>
+          <w:start w:w="55" w:type="dxa"/>
+          <w:bottom w:w="55" w:type="dxa"/>
+          <w:end w:w="55" w:type="dxa"/>
+        </w:tblCellMar>
+      </w:tblPr>
+      <w:tblGrid>
+        <w:gridCol w:w="9638"/>
+      </w:tblGrid>
+      <w:tr>
+        <w:trPr/>
+        <w:tc>
+          <w:tcPr>
+            <w:tcW w:w="9638" w:type="dxa"/>
+            <w:tcBorders>
+              <w:top w:val="single" w:sz="4" w:space="0" w:color="000000"/>
+              <w:start w:val="single" w:sz="4" w:space="0" w:color="000000"/>
+              <w:bottom w:val="single" w:sz="4" w:space="0" w:color="000000"/>
+              <w:end w:val="single" w:sz="4" w:space="0" w:color="000000"/>
+            </w:tcBorders>
+          </w:tcPr>
+          <w:p>
+            <w:pPr>
+              <w:pStyle w:val="Normal"/>
+              <w:pBdr/>
+              <w:shd w:fill="FFFFFF" w:val="clear"/>
+              <w:jc w:val="start"/>
+              <w:rPr>
+                <w:rFonts w:ascii="Consolas" w:hAnsi="Consolas"/>
+                <w:sz w:val="20"/>
+                <w:szCs w:val="20"/>
+              </w:rPr>
+            </w:pPr>
+            <w:r>
+              <w:rPr>
+                <w:rFonts w:ascii="Consolas" w:hAnsi="Consolas"/>
+                <w:b w:val="false"/>
+                <w:i w:val="false"/>
+                <w:color w:val="9E880D"/>
+                <w:sz w:val="20"/>
+                <w:szCs w:val="20"/>
+              </w:rPr>
+              <w:t>@Repository</w:t>
+              <w:br/>
+            </w:r>
+            <w:r>
+              <w:rPr>
+                <w:rFonts w:ascii="Consolas" w:hAnsi="Consolas"/>
+                <w:b w:val="false"/>
+                <w:i w:val="false"/>
+                <w:color w:val="0033B3"/>
+                <w:sz w:val="20"/>
+                <w:szCs w:val="20"/>
+              </w:rPr>
+              <w:t xml:space="preserve">public interface </w:t>
+            </w:r>
+            <w:r>
+              <w:rPr>
+                <w:rFonts w:ascii="Consolas" w:hAnsi="Consolas"/>
+                <w:b w:val="false"/>
+                <w:i w:val="false"/>
+                <w:color w:val="000000"/>
+                <w:sz w:val="20"/>
+                <w:szCs w:val="20"/>
+              </w:rPr>
+              <w:t xml:space="preserve">JsonSchemaRepository </w:t>
+            </w:r>
+            <w:r>
+              <w:rPr>
+                <w:rFonts w:ascii="Consolas" w:hAnsi="Consolas"/>
+                <w:b w:val="false"/>
+                <w:i w:val="false"/>
+                <w:color w:val="0033B3"/>
+                <w:sz w:val="20"/>
+                <w:szCs w:val="20"/>
+              </w:rPr>
+              <w:t xml:space="preserve">extends </w:t>
+            </w:r>
+            <w:r>
+              <w:rPr>
+                <w:rFonts w:ascii="Consolas" w:hAnsi="Consolas"/>
+                <w:b w:val="false"/>
+                <w:i w:val="false"/>
+                <w:color w:val="000000"/>
+                <w:sz w:val="20"/>
+                <w:szCs w:val="20"/>
+              </w:rPr>
+              <w:t>MongoRepository</w:t>
+            </w:r>
+            <w:r>
+              <w:rPr>
+                <w:rFonts w:ascii="Consolas" w:hAnsi="Consolas"/>
+                <w:b w:val="false"/>
+                <w:i w:val="false"/>
+                <w:color w:val="080808"/>
+                <w:sz w:val="20"/>
+                <w:szCs w:val="20"/>
+              </w:rPr>
+              <w:t>&lt;</w:t>
+            </w:r>
+            <w:r>
+              <w:rPr>
+                <w:rFonts w:ascii="Consolas" w:hAnsi="Consolas"/>
+                <w:b w:val="false"/>
+                <w:i w:val="false"/>
+                <w:color w:val="000000"/>
+                <w:sz w:val="20"/>
+                <w:szCs w:val="20"/>
+              </w:rPr>
+              <w:t>JsonSchema</w:t>
+            </w:r>
+            <w:r>
+              <w:rPr>
+                <w:rFonts w:ascii="Consolas" w:hAnsi="Consolas"/>
+                <w:b w:val="false"/>
+                <w:i w:val="false"/>
+                <w:color w:val="080808"/>
+                <w:sz w:val="20"/>
+                <w:szCs w:val="20"/>
+              </w:rPr>
+              <w:t xml:space="preserve">, </w:t>
+            </w:r>
+            <w:r>
+              <w:rPr>
+                <w:rFonts w:ascii="Consolas" w:hAnsi="Consolas"/>
+                <w:b w:val="false"/>
+                <w:i w:val="false"/>
+                <w:color w:val="000000"/>
+                <w:sz w:val="20"/>
+                <w:szCs w:val="20"/>
+              </w:rPr>
+              <w:t>String</w:t>
+            </w:r>
+            <w:r>
+              <w:rPr>
+                <w:rFonts w:ascii="Consolas" w:hAnsi="Consolas"/>
+                <w:b w:val="false"/>
+                <w:i w:val="false"/>
+                <w:color w:val="080808"/>
+                <w:sz w:val="20"/>
+                <w:szCs w:val="20"/>
+              </w:rPr>
+              <w:t>&gt; {</w:t>
+              <w:br/>
+              <w:t>}</w:t>
+            </w:r>
+          </w:p>
+        </w:tc>
+      </w:tr>
+    </w:tbl>
+    <w:p>
+      <w:pPr>
+        <w:pStyle w:val="Normal"/>
+        <w:rPr/>
+      </w:pPr>
+      <w:r>
+        <w:rPr/>
+      </w:r>
+    </w:p>
+    <w:p>
+      <w:pPr>
+        <w:pStyle w:val="Normal"/>
         <w:rPr/>
       </w:pPr>
       <w:r>
@@ -3107,6 +4594,18 @@
           <w:t>https://json-schema.org</w:t>
         </w:r>
       </w:hyperlink>
+    </w:p>
+    <w:p>
+      <w:pPr>
+        <w:pStyle w:val="Normal"/>
+        <w:rPr/>
+      </w:pPr>
+      <w:r>
+        <w:rPr>
+          <w:rStyle w:val="Hyperlink"/>
+        </w:rPr>
+        <w:t>https://www.learnjsonschema.com/2020-12/</w:t>
+      </w:r>
     </w:p>
     <w:sectPr>
       <w:type w:val="nextPage"/>
@@ -3667,7 +5166,7 @@
       <w:kern w:val="0"/>
       <w:sz w:val="24"/>
       <w:szCs w:val="20"/>
-      <w:lang w:eastAsia="pl-PL" w:val="pl-PL" w:bidi="ar-SA"/>
+      <w:lang w:val="pl-PL" w:eastAsia="pl-PL" w:bidi="ar-SA"/>
     </w:rPr>
   </w:style>
   <w:style w:type="paragraph" w:styleId="Heading1">
@@ -4081,6 +5580,13 @@
     <w:qFormat/>
     <w:rPr/>
   </w:style>
+  <w:style w:type="character" w:styleId="FollowedHyperlink">
+    <w:name w:val="FollowedHyperlink"/>
+    <w:rPr>
+      <w:color w:val="800000"/>
+      <w:u w:val="single"/>
+    </w:rPr>
+  </w:style>
   <w:style w:type="paragraph" w:styleId="Heading" w:customStyle="1">
     <w:name w:val="Heading"/>
     <w:basedOn w:val="Normal"/>
@@ -4500,6 +6006,13 @@
       <w:b/>
       <w:bCs/>
     </w:rPr>
+  </w:style>
+  <w:style w:type="paragraph" w:styleId="Tabela">
+    <w:name w:val="Tabela"/>
+    <w:basedOn w:val="Caption"/>
+    <w:qFormat/>
+    <w:pPr/>
+    <w:rPr/>
   </w:style>
   <w:style w:type="numbering" w:styleId="NoList" w:default="1">
     <w:name w:val="No List"/>
@@ -4568,37 +6081,37 @@
         <a:srgbClr val="000000"/>
       </a:dk1>
       <a:lt1>
-        <a:srgbClr val="ffffff"/>
+        <a:srgbClr val="FFFFFF"/>
       </a:lt1>
       <a:dk2>
-        <a:srgbClr val="44546a"/>
+        <a:srgbClr val="44546A"/>
       </a:dk2>
       <a:lt2>
-        <a:srgbClr val="e7e6e6"/>
+        <a:srgbClr val="E7E6E6"/>
       </a:lt2>
       <a:accent1>
-        <a:srgbClr val="4472c4"/>
+        <a:srgbClr val="4472C4"/>
       </a:accent1>
       <a:accent2>
-        <a:srgbClr val="ed7d31"/>
+        <a:srgbClr val="ED7D31"/>
       </a:accent2>
       <a:accent3>
-        <a:srgbClr val="a5a5a5"/>
+        <a:srgbClr val="A5A5A5"/>
       </a:accent3>
       <a:accent4>
-        <a:srgbClr val="ffc000"/>
+        <a:srgbClr val="FFC000"/>
       </a:accent4>
       <a:accent5>
-        <a:srgbClr val="5b9bd5"/>
+        <a:srgbClr val="5B9BD5"/>
       </a:accent5>
       <a:accent6>
-        <a:srgbClr val="70ad47"/>
+        <a:srgbClr val="70AD47"/>
       </a:accent6>
       <a:hlink>
-        <a:srgbClr val="0563c1"/>
+        <a:srgbClr val="0563C1"/>
       </a:hlink>
       <a:folHlink>
-        <a:srgbClr val="954f72"/>
+        <a:srgbClr val="954F72"/>
       </a:folHlink>
     </a:clrScheme>
     <a:fontScheme name="Office">

</xml_diff>